<commit_message>
docs: record successful security pipeline evidence
</commit_message>
<xml_diff>
--- a/docs/Actividad_1_Laboratorio_Tecnico.docx
+++ b/docs/Actividad_1_Laboratorio_Tecnico.docx
@@ -409,7 +409,7 @@
           <w:rFonts w:ascii="Aptos" w:hAnsi="Aptos"/>
           <w:sz w:val="22"/>
         </w:rPr>
-        <w:t>La ejecucion Jenkins #7 documentada durante la practica termino en `SUCCESS`: ejecuto las etapas de checkout, dependencias, analisis estatico, pruebas unitarias, build Docker, validacion Helm, publicacion de imagen y actualizacion GitOps. La evidencia operativa y la lista de capturas estan consolidadas en `docs/EVIDENCIA_OPERATIVA.md`.</w:t>
+        <w:t>La ejecucion Jenkins #7 documentada durante la practica termino en `SUCCESS`: ejecuto las etapas de checkout, dependencias, analisis estatico, pruebas unitarias, build Docker, validacion Helm, publicacion de imagen y actualizacion GitOps. Adicionalmente, la ejecucion GitHub Actions `33334905943` del 30 de agosto de 2026 finalizo exitosamente con los jobs `lint`, `test`, `docker-build-validation`, `snyk` y `sonarcloud`. La evidencia operativa y la lista de capturas estan consolidadas en `docs/EVIDENCIA_OPERATIVA.md`.</w:t>
       </w:r>
     </w:p>
     <w:p>
@@ -636,16 +636,16 @@
           <w:noProof/>
         </w:rPr>
         <w:drawing>
-          <wp:inline distT="0" distB="0" distL="0" distR="0" wp14:anchorId="45A43087" wp14:editId="3C36692A">
+          <wp:inline distT="0" distB="0" distL="0" distR="0" wp14:anchorId="3DD89BDF" wp14:editId="272D6BBC">
             <wp:extent cx="5842000" cy="3302000"/>
             <wp:effectExtent l="0" t="0" r="6350" b="0"/>
-            <wp:docPr id="1713628064" name="Imagen 1"/>
+            <wp:docPr id="2009975329" name="Imagen 1"/>
             <wp:cNvGraphicFramePr/>
             <a:graphic xmlns:a="http://schemas.openxmlformats.org/drawingml/2006/main">
               <a:graphicData uri="http://schemas.openxmlformats.org/drawingml/2006/picture">
                 <pic:pic xmlns:pic="http://schemas.openxmlformats.org/drawingml/2006/picture">
                   <pic:nvPicPr>
-                    <pic:cNvPr id="1713628064" name=""/>
+                    <pic:cNvPr id="2009975329" name=""/>
                     <pic:cNvPicPr/>
                   </pic:nvPicPr>
                   <pic:blipFill>
@@ -689,7 +689,7 @@
 <file path=word/numbering.xml><?xml version="1.0" encoding="utf-8"?>
 <w:numbering xmlns:wpc="http://schemas.microsoft.com/office/word/2010/wordprocessingCanvas" xmlns:cx="http://schemas.microsoft.com/office/drawing/2014/chartex" xmlns:cx1="http://schemas.microsoft.com/office/drawing/2015/9/8/chartex" xmlns:cx2="http://schemas.microsoft.com/office/drawing/2015/10/21/chartex" xmlns:cx3="http://schemas.microsoft.com/office/drawing/2016/5/9/chartex" xmlns:cx4="http://schemas.microsoft.com/office/drawing/2016/5/10/chartex" xmlns:cx5="http://schemas.microsoft.com/office/drawing/2016/5/11/chartex" xmlns:cx6="http://schemas.microsoft.com/office/drawing/2016/5/12/chartex" xmlns:cx7="http://schemas.microsoft.com/office/drawing/2016/5/13/chartex" xmlns:cx8="http://schemas.microsoft.com/office/drawing/2016/5/14/chartex" xmlns:mc="http://schemas.openxmlformats.org/markup-compatibility/2006" xmlns:aink="http://schemas.microsoft.com/office/drawing/2016/ink" xmlns:am3d="http://schemas.microsoft.com/office/drawing/2017/model3d" xmlns:o="urn:schemas-microsoft-com:office:office" xmlns:oel="http://schemas.microsoft.com/office/2019/extlst" xmlns:r="http://schemas.openxmlformats.org/officeDocument/2006/relationships" xmlns:m="http://schemas.openxmlformats.org/officeDocument/2006/math" xmlns:v="urn:schemas-microsoft-com:vml" xmlns:wp14="http://schemas.microsoft.com/office/word/2010/wordprocessingDrawing" xmlns:wp="http://schemas.openxmlformats.org/drawingml/2006/wordprocessingDrawing" xmlns:w10="urn:schemas-microsoft-com:office:word" xmlns:w="http://schemas.openxmlformats.org/wordprocessingml/2006/main" xmlns:w14="http://schemas.microsoft.com/office/word/2010/wordml" xmlns:w15="http://schemas.microsoft.com/office/word/2012/wordml" xmlns:w16cex="http://schemas.microsoft.com/office/word/2018/wordml/cex" xmlns:w16cid="http://schemas.microsoft.com/office/word/2016/wordml/cid" xmlns:w16="http://schemas.microsoft.com/office/word/2018/wordml" xmlns:w16du="http://schemas.microsoft.com/office/word/2023/wordml/word16du" xmlns:w16sdtdh="http://schemas.microsoft.com/office/word/2020/wordml/sdtdatahash" xmlns:w16sdtfl="http://schemas.microsoft.com/office/word/2024/wordml/sdtformatlock" xmlns:w16se="http://schemas.microsoft.com/office/word/2015/wordml/symex" xmlns:wpg="http://schemas.microsoft.com/office/word/2010/wordprocessingGroup" xmlns:wpi="http://schemas.microsoft.com/office/word/2010/wordprocessingInk" xmlns:wne="http://schemas.microsoft.com/office/word/2006/wordml" xmlns:wps="http://schemas.microsoft.com/office/word/2010/wordprocessingShape" mc:Ignorable="w14 w15 w16se w16cid w16 w16cex w16sdtdh w16sdtfl w16du wp14">
   <w:abstractNum w:abstractNumId="0" w15:restartNumberingAfterBreak="0">
-    <w:nsid w:val="69327D38"/>
+    <w:nsid w:val="5BF1075D"/>
     <w:multiLevelType w:val="singleLevel"/>
     <w:tmpl w:val="580A000F"/>
     <w:lvl w:ilvl="0">
@@ -702,7 +702,7 @@
       </w:pPr>
     </w:lvl>
   </w:abstractNum>
-  <w:num w:numId="1" w16cid:durableId="92747701">
+  <w:num w:numId="1" w16cid:durableId="885989376">
     <w:abstractNumId w:val="0"/>
   </w:num>
 </w:numbering>
@@ -1116,7 +1116,7 @@
     <w:link w:val="Ttulo1Car"/>
     <w:uiPriority w:val="9"/>
     <w:qFormat/>
-    <w:rsid w:val="00780505"/>
+    <w:rsid w:val="00E56DCA"/>
     <w:pPr>
       <w:keepNext/>
       <w:keepLines/>
@@ -1139,7 +1139,7 @@
     <w:semiHidden/>
     <w:unhideWhenUsed/>
     <w:qFormat/>
-    <w:rsid w:val="00780505"/>
+    <w:rsid w:val="00E56DCA"/>
     <w:pPr>
       <w:keepNext/>
       <w:keepLines/>
@@ -1162,7 +1162,7 @@
     <w:semiHidden/>
     <w:unhideWhenUsed/>
     <w:qFormat/>
-    <w:rsid w:val="00780505"/>
+    <w:rsid w:val="00E56DCA"/>
     <w:pPr>
       <w:keepNext/>
       <w:keepLines/>
@@ -1185,7 +1185,7 @@
     <w:semiHidden/>
     <w:unhideWhenUsed/>
     <w:qFormat/>
-    <w:rsid w:val="00780505"/>
+    <w:rsid w:val="00E56DCA"/>
     <w:pPr>
       <w:keepNext/>
       <w:keepLines/>
@@ -1208,7 +1208,7 @@
     <w:semiHidden/>
     <w:unhideWhenUsed/>
     <w:qFormat/>
-    <w:rsid w:val="00780505"/>
+    <w:rsid w:val="00E56DCA"/>
     <w:pPr>
       <w:keepNext/>
       <w:keepLines/>
@@ -1229,7 +1229,7 @@
     <w:semiHidden/>
     <w:unhideWhenUsed/>
     <w:qFormat/>
-    <w:rsid w:val="00780505"/>
+    <w:rsid w:val="00E56DCA"/>
     <w:pPr>
       <w:keepNext/>
       <w:keepLines/>
@@ -1252,7 +1252,7 @@
     <w:semiHidden/>
     <w:unhideWhenUsed/>
     <w:qFormat/>
-    <w:rsid w:val="00780505"/>
+    <w:rsid w:val="00E56DCA"/>
     <w:pPr>
       <w:keepNext/>
       <w:keepLines/>
@@ -1273,7 +1273,7 @@
     <w:semiHidden/>
     <w:unhideWhenUsed/>
     <w:qFormat/>
-    <w:rsid w:val="00780505"/>
+    <w:rsid w:val="00E56DCA"/>
     <w:pPr>
       <w:keepNext/>
       <w:keepLines/>
@@ -1296,7 +1296,7 @@
     <w:semiHidden/>
     <w:unhideWhenUsed/>
     <w:qFormat/>
-    <w:rsid w:val="00780505"/>
+    <w:rsid w:val="00E56DCA"/>
     <w:pPr>
       <w:keepNext/>
       <w:keepLines/>
@@ -1340,7 +1340,7 @@
     <w:basedOn w:val="Fuentedeprrafopredeter"/>
     <w:link w:val="Ttulo1"/>
     <w:uiPriority w:val="9"/>
-    <w:rsid w:val="00780505"/>
+    <w:rsid w:val="00E56DCA"/>
     <w:rPr>
       <w:rFonts w:asciiTheme="majorHAnsi" w:eastAsiaTheme="majorEastAsia" w:hAnsiTheme="majorHAnsi" w:cstheme="majorBidi"/>
       <w:color w:val="0F4761" w:themeColor="accent1" w:themeShade="BF"/>
@@ -1354,7 +1354,7 @@
     <w:link w:val="Ttulo2"/>
     <w:uiPriority w:val="9"/>
     <w:semiHidden/>
-    <w:rsid w:val="00780505"/>
+    <w:rsid w:val="00E56DCA"/>
     <w:rPr>
       <w:rFonts w:asciiTheme="majorHAnsi" w:eastAsiaTheme="majorEastAsia" w:hAnsiTheme="majorHAnsi" w:cstheme="majorBidi"/>
       <w:color w:val="0F4761" w:themeColor="accent1" w:themeShade="BF"/>
@@ -1368,7 +1368,7 @@
     <w:link w:val="Ttulo3"/>
     <w:uiPriority w:val="9"/>
     <w:semiHidden/>
-    <w:rsid w:val="00780505"/>
+    <w:rsid w:val="00E56DCA"/>
     <w:rPr>
       <w:rFonts w:eastAsiaTheme="majorEastAsia" w:cstheme="majorBidi"/>
       <w:color w:val="0F4761" w:themeColor="accent1" w:themeShade="BF"/>
@@ -1382,7 +1382,7 @@
     <w:link w:val="Ttulo4"/>
     <w:uiPriority w:val="9"/>
     <w:semiHidden/>
-    <w:rsid w:val="00780505"/>
+    <w:rsid w:val="00E56DCA"/>
     <w:rPr>
       <w:rFonts w:eastAsiaTheme="majorEastAsia" w:cstheme="majorBidi"/>
       <w:i/>
@@ -1396,7 +1396,7 @@
     <w:link w:val="Ttulo5"/>
     <w:uiPriority w:val="9"/>
     <w:semiHidden/>
-    <w:rsid w:val="00780505"/>
+    <w:rsid w:val="00E56DCA"/>
     <w:rPr>
       <w:rFonts w:eastAsiaTheme="majorEastAsia" w:cstheme="majorBidi"/>
       <w:color w:val="0F4761" w:themeColor="accent1" w:themeShade="BF"/>
@@ -1408,7 +1408,7 @@
     <w:link w:val="Ttulo6"/>
     <w:uiPriority w:val="9"/>
     <w:semiHidden/>
-    <w:rsid w:val="00780505"/>
+    <w:rsid w:val="00E56DCA"/>
     <w:rPr>
       <w:rFonts w:eastAsiaTheme="majorEastAsia" w:cstheme="majorBidi"/>
       <w:i/>
@@ -1422,7 +1422,7 @@
     <w:link w:val="Ttulo7"/>
     <w:uiPriority w:val="9"/>
     <w:semiHidden/>
-    <w:rsid w:val="00780505"/>
+    <w:rsid w:val="00E56DCA"/>
     <w:rPr>
       <w:rFonts w:eastAsiaTheme="majorEastAsia" w:cstheme="majorBidi"/>
       <w:color w:val="595959" w:themeColor="text1" w:themeTint="A6"/>
@@ -1434,7 +1434,7 @@
     <w:link w:val="Ttulo8"/>
     <w:uiPriority w:val="9"/>
     <w:semiHidden/>
-    <w:rsid w:val="00780505"/>
+    <w:rsid w:val="00E56DCA"/>
     <w:rPr>
       <w:rFonts w:eastAsiaTheme="majorEastAsia" w:cstheme="majorBidi"/>
       <w:i/>
@@ -1448,7 +1448,7 @@
     <w:link w:val="Ttulo9"/>
     <w:uiPriority w:val="9"/>
     <w:semiHidden/>
-    <w:rsid w:val="00780505"/>
+    <w:rsid w:val="00E56DCA"/>
     <w:rPr>
       <w:rFonts w:eastAsiaTheme="majorEastAsia" w:cstheme="majorBidi"/>
       <w:color w:val="272727" w:themeColor="text1" w:themeTint="D8"/>
@@ -1461,7 +1461,7 @@
     <w:link w:val="TtuloCar"/>
     <w:uiPriority w:val="10"/>
     <w:qFormat/>
-    <w:rsid w:val="00780505"/>
+    <w:rsid w:val="00E56DCA"/>
     <w:pPr>
       <w:spacing w:after="80" w:line="240" w:lineRule="auto"/>
       <w:contextualSpacing/>
@@ -1479,7 +1479,7 @@
     <w:basedOn w:val="Fuentedeprrafopredeter"/>
     <w:link w:val="Ttulo"/>
     <w:uiPriority w:val="10"/>
-    <w:rsid w:val="00780505"/>
+    <w:rsid w:val="00E56DCA"/>
     <w:rPr>
       <w:rFonts w:asciiTheme="majorHAnsi" w:eastAsiaTheme="majorEastAsia" w:hAnsiTheme="majorHAnsi" w:cstheme="majorBidi"/>
       <w:spacing w:val="-10"/>
@@ -1495,7 +1495,7 @@
     <w:link w:val="SubttuloCar"/>
     <w:uiPriority w:val="11"/>
     <w:qFormat/>
-    <w:rsid w:val="00780505"/>
+    <w:rsid w:val="00E56DCA"/>
     <w:pPr>
       <w:numPr>
         <w:ilvl w:val="1"/>
@@ -1514,7 +1514,7 @@
     <w:basedOn w:val="Fuentedeprrafopredeter"/>
     <w:link w:val="Subttulo"/>
     <w:uiPriority w:val="11"/>
-    <w:rsid w:val="00780505"/>
+    <w:rsid w:val="00E56DCA"/>
     <w:rPr>
       <w:rFonts w:eastAsiaTheme="majorEastAsia" w:cstheme="majorBidi"/>
       <w:color w:val="595959" w:themeColor="text1" w:themeTint="A6"/>
@@ -1530,7 +1530,7 @@
     <w:link w:val="CitaCar"/>
     <w:uiPriority w:val="29"/>
     <w:qFormat/>
-    <w:rsid w:val="00780505"/>
+    <w:rsid w:val="00E56DCA"/>
     <w:pPr>
       <w:spacing w:before="160"/>
       <w:jc w:val="center"/>
@@ -1546,7 +1546,7 @@
     <w:basedOn w:val="Fuentedeprrafopredeter"/>
     <w:link w:val="Cita"/>
     <w:uiPriority w:val="29"/>
-    <w:rsid w:val="00780505"/>
+    <w:rsid w:val="00E56DCA"/>
     <w:rPr>
       <w:i/>
       <w:iCs/>
@@ -1558,7 +1558,7 @@
     <w:basedOn w:val="Normal"/>
     <w:uiPriority w:val="34"/>
     <w:qFormat/>
-    <w:rsid w:val="00780505"/>
+    <w:rsid w:val="00E56DCA"/>
     <w:pPr>
       <w:ind w:left="720"/>
       <w:contextualSpacing/>
@@ -1569,7 +1569,7 @@
     <w:basedOn w:val="Fuentedeprrafopredeter"/>
     <w:uiPriority w:val="21"/>
     <w:qFormat/>
-    <w:rsid w:val="00780505"/>
+    <w:rsid w:val="00E56DCA"/>
     <w:rPr>
       <w:i/>
       <w:iCs/>
@@ -1583,7 +1583,7 @@
     <w:link w:val="CitadestacadaCar"/>
     <w:uiPriority w:val="30"/>
     <w:qFormat/>
-    <w:rsid w:val="00780505"/>
+    <w:rsid w:val="00E56DCA"/>
     <w:pPr>
       <w:pBdr>
         <w:top w:val="single" w:sz="4" w:space="10" w:color="0F4761" w:themeColor="accent1" w:themeShade="BF"/>
@@ -1604,7 +1604,7 @@
     <w:basedOn w:val="Fuentedeprrafopredeter"/>
     <w:link w:val="Citadestacada"/>
     <w:uiPriority w:val="30"/>
-    <w:rsid w:val="00780505"/>
+    <w:rsid w:val="00E56DCA"/>
     <w:rPr>
       <w:i/>
       <w:iCs/>
@@ -1616,7 +1616,7 @@
     <w:basedOn w:val="Fuentedeprrafopredeter"/>
     <w:uiPriority w:val="32"/>
     <w:qFormat/>
-    <w:rsid w:val="00780505"/>
+    <w:rsid w:val="00E56DCA"/>
     <w:rPr>
       <w:b/>
       <w:bCs/>

</xml_diff>

<commit_message>
docs: add complete CI CD security and monitoring evidence
</commit_message>
<xml_diff>
--- a/docs/Actividad_1_Laboratorio_Tecnico.docx
+++ b/docs/Actividad_1_Laboratorio_Tecnico.docx
@@ -409,7 +409,7 @@
           <w:rFonts w:ascii="Aptos" w:hAnsi="Aptos"/>
           <w:sz w:val="22"/>
         </w:rPr>
-        <w:t>La ejecucion Jenkins #7 documentada durante la practica termino en `SUCCESS`: ejecuto las etapas de checkout, dependencias, analisis estatico, pruebas unitarias, build Docker, validacion Helm, publicacion de imagen y actualizacion GitOps. Adicionalmente, la ejecucion GitHub Actions `33334905943` del 30 de agosto de 2026 finalizo exitosamente con los jobs `lint`, `test`, `docker-build-validation`, `snyk` y `sonarcloud`. La evidencia operativa y la lista de capturas estan consolidadas en `docs/EVIDENCIA_OPERATIVA.md`.</w:t>
+        <w:t>La ejecucion Jenkins #7 documentada durante la practica termino en `SUCCESS`: ejecuto las etapas de checkout, dependencias, analisis estatico, pruebas unitarias, build Docker, validacion Helm, publicacion de imagen y actualizacion GitOps. Adicionalmente, la ejecucion GitHub Actions `33335315017` del 30 de agosto de 2026 finalizo exitosamente con los jobs `lint`, `test`, `docker-build-validation`, `snyk` y `sonarcloud`, y publico el artefacto descargable `snyk-report`. La evidencia operativa y las capturas propias estan consolidadas en `docs/EVIDENCIA_OPERATIVA.md`.</w:t>
       </w:r>
     </w:p>
     <w:p>
@@ -626,26 +626,75 @@
         <w:pStyle w:val="Ttulo1"/>
       </w:pPr>
       <w:r>
-        <w:lastRenderedPageBreak/>
+        <w:t>Evidencia visual: GitHub Actions, SonarCloud y Snyk</w:t>
+      </w:r>
+    </w:p>
+    <w:p/>
+    <w:p/>
+    <w:p>
+      <w:pPr>
+        <w:pStyle w:val="Ttulo1"/>
+        <w:rPr>
+          <w:noProof/>
+        </w:rPr>
+      </w:pPr>
+      <w:r>
+        <w:rPr>
+          <w:noProof/>
+        </w:rPr>
+        <w:t>Evidencia visual: Quality Gate de SonarQube Cloud</w:t>
+      </w:r>
+    </w:p>
+    <w:p/>
+    <w:p/>
+    <w:p>
+      <w:pPr>
+        <w:pStyle w:val="Ttulo1"/>
+        <w:rPr>
+          <w:noProof/>
+        </w:rPr>
+      </w:pPr>
+      <w:r>
+        <w:rPr>
+          <w:noProof/>
+        </w:rPr>
+        <w:t>Evidencia visual: target Prometheus en estado UP</w:t>
+      </w:r>
+    </w:p>
+    <w:p/>
+    <w:p/>
+    <w:p>
+      <w:pPr>
+        <w:pStyle w:val="Ttulo1"/>
+        <w:rPr>
+          <w:noProof/>
+        </w:rPr>
+      </w:pPr>
+      <w:r>
+        <w:rPr>
+          <w:noProof/>
+        </w:rPr>
         <w:t>Evidencia visual: dashboard Grafana activo</w:t>
       </w:r>
     </w:p>
+    <w:p/>
+    <w:p/>
     <w:p>
       <w:r>
         <w:rPr>
           <w:noProof/>
         </w:rPr>
         <w:drawing>
-          <wp:inline distT="0" distB="0" distL="0" distR="0" wp14:anchorId="3DD89BDF" wp14:editId="272D6BBC">
+          <wp:inline distT="0" distB="0" distL="0" distR="0" wp14:anchorId="3EE88740" wp14:editId="2F4FE180">
             <wp:extent cx="5842000" cy="3302000"/>
             <wp:effectExtent l="0" t="0" r="6350" b="0"/>
-            <wp:docPr id="2009975329" name="Imagen 1"/>
+            <wp:docPr id="1212623055" name="Imagen 4"/>
             <wp:cNvGraphicFramePr/>
             <a:graphic xmlns:a="http://schemas.openxmlformats.org/drawingml/2006/main">
               <a:graphicData uri="http://schemas.openxmlformats.org/drawingml/2006/picture">
                 <pic:pic xmlns:pic="http://schemas.openxmlformats.org/drawingml/2006/picture">
                   <pic:nvPicPr>
-                    <pic:cNvPr id="2009975329" name=""/>
+                    <pic:cNvPr id="1212623055" name=""/>
                     <pic:cNvPicPr/>
                   </pic:nvPicPr>
                   <pic:blipFill>
@@ -689,7 +738,7 @@
 <file path=word/numbering.xml><?xml version="1.0" encoding="utf-8"?>
 <w:numbering xmlns:wpc="http://schemas.microsoft.com/office/word/2010/wordprocessingCanvas" xmlns:cx="http://schemas.microsoft.com/office/drawing/2014/chartex" xmlns:cx1="http://schemas.microsoft.com/office/drawing/2015/9/8/chartex" xmlns:cx2="http://schemas.microsoft.com/office/drawing/2015/10/21/chartex" xmlns:cx3="http://schemas.microsoft.com/office/drawing/2016/5/9/chartex" xmlns:cx4="http://schemas.microsoft.com/office/drawing/2016/5/10/chartex" xmlns:cx5="http://schemas.microsoft.com/office/drawing/2016/5/11/chartex" xmlns:cx6="http://schemas.microsoft.com/office/drawing/2016/5/12/chartex" xmlns:cx7="http://schemas.microsoft.com/office/drawing/2016/5/13/chartex" xmlns:cx8="http://schemas.microsoft.com/office/drawing/2016/5/14/chartex" xmlns:mc="http://schemas.openxmlformats.org/markup-compatibility/2006" xmlns:aink="http://schemas.microsoft.com/office/drawing/2016/ink" xmlns:am3d="http://schemas.microsoft.com/office/drawing/2017/model3d" xmlns:o="urn:schemas-microsoft-com:office:office" xmlns:oel="http://schemas.microsoft.com/office/2019/extlst" xmlns:r="http://schemas.openxmlformats.org/officeDocument/2006/relationships" xmlns:m="http://schemas.openxmlformats.org/officeDocument/2006/math" xmlns:v="urn:schemas-microsoft-com:vml" xmlns:wp14="http://schemas.microsoft.com/office/word/2010/wordprocessingDrawing" xmlns:wp="http://schemas.openxmlformats.org/drawingml/2006/wordprocessingDrawing" xmlns:w10="urn:schemas-microsoft-com:office:word" xmlns:w="http://schemas.openxmlformats.org/wordprocessingml/2006/main" xmlns:w14="http://schemas.microsoft.com/office/word/2010/wordml" xmlns:w15="http://schemas.microsoft.com/office/word/2012/wordml" xmlns:w16cex="http://schemas.microsoft.com/office/word/2018/wordml/cex" xmlns:w16cid="http://schemas.microsoft.com/office/word/2016/wordml/cid" xmlns:w16="http://schemas.microsoft.com/office/word/2018/wordml" xmlns:w16du="http://schemas.microsoft.com/office/word/2023/wordml/word16du" xmlns:w16sdtdh="http://schemas.microsoft.com/office/word/2020/wordml/sdtdatahash" xmlns:w16sdtfl="http://schemas.microsoft.com/office/word/2024/wordml/sdtformatlock" xmlns:w16se="http://schemas.microsoft.com/office/word/2015/wordml/symex" xmlns:wpg="http://schemas.microsoft.com/office/word/2010/wordprocessingGroup" xmlns:wpi="http://schemas.microsoft.com/office/word/2010/wordprocessingInk" xmlns:wne="http://schemas.microsoft.com/office/word/2006/wordml" xmlns:wps="http://schemas.microsoft.com/office/word/2010/wordprocessingShape" mc:Ignorable="w14 w15 w16se w16cid w16 w16cex w16sdtdh w16sdtfl w16du wp14">
   <w:abstractNum w:abstractNumId="0" w15:restartNumberingAfterBreak="0">
-    <w:nsid w:val="5BF1075D"/>
+    <w:nsid w:val="42B736ED"/>
     <w:multiLevelType w:val="singleLevel"/>
     <w:tmpl w:val="580A000F"/>
     <w:lvl w:ilvl="0">
@@ -702,7 +751,7 @@
       </w:pPr>
     </w:lvl>
   </w:abstractNum>
-  <w:num w:numId="1" w16cid:durableId="885989376">
+  <w:num w:numId="1" w16cid:durableId="1509713568">
     <w:abstractNumId w:val="0"/>
   </w:num>
 </w:numbering>
@@ -1116,7 +1165,7 @@
     <w:link w:val="Ttulo1Car"/>
     <w:uiPriority w:val="9"/>
     <w:qFormat/>
-    <w:rsid w:val="00E56DCA"/>
+    <w:rsid w:val="000605EF"/>
     <w:pPr>
       <w:keepNext/>
       <w:keepLines/>
@@ -1139,7 +1188,7 @@
     <w:semiHidden/>
     <w:unhideWhenUsed/>
     <w:qFormat/>
-    <w:rsid w:val="00E56DCA"/>
+    <w:rsid w:val="000605EF"/>
     <w:pPr>
       <w:keepNext/>
       <w:keepLines/>
@@ -1162,7 +1211,7 @@
     <w:semiHidden/>
     <w:unhideWhenUsed/>
     <w:qFormat/>
-    <w:rsid w:val="00E56DCA"/>
+    <w:rsid w:val="000605EF"/>
     <w:pPr>
       <w:keepNext/>
       <w:keepLines/>
@@ -1185,7 +1234,7 @@
     <w:semiHidden/>
     <w:unhideWhenUsed/>
     <w:qFormat/>
-    <w:rsid w:val="00E56DCA"/>
+    <w:rsid w:val="000605EF"/>
     <w:pPr>
       <w:keepNext/>
       <w:keepLines/>
@@ -1208,7 +1257,7 @@
     <w:semiHidden/>
     <w:unhideWhenUsed/>
     <w:qFormat/>
-    <w:rsid w:val="00E56DCA"/>
+    <w:rsid w:val="000605EF"/>
     <w:pPr>
       <w:keepNext/>
       <w:keepLines/>
@@ -1229,7 +1278,7 @@
     <w:semiHidden/>
     <w:unhideWhenUsed/>
     <w:qFormat/>
-    <w:rsid w:val="00E56DCA"/>
+    <w:rsid w:val="000605EF"/>
     <w:pPr>
       <w:keepNext/>
       <w:keepLines/>
@@ -1252,7 +1301,7 @@
     <w:semiHidden/>
     <w:unhideWhenUsed/>
     <w:qFormat/>
-    <w:rsid w:val="00E56DCA"/>
+    <w:rsid w:val="000605EF"/>
     <w:pPr>
       <w:keepNext/>
       <w:keepLines/>
@@ -1273,7 +1322,7 @@
     <w:semiHidden/>
     <w:unhideWhenUsed/>
     <w:qFormat/>
-    <w:rsid w:val="00E56DCA"/>
+    <w:rsid w:val="000605EF"/>
     <w:pPr>
       <w:keepNext/>
       <w:keepLines/>
@@ -1296,7 +1345,7 @@
     <w:semiHidden/>
     <w:unhideWhenUsed/>
     <w:qFormat/>
-    <w:rsid w:val="00E56DCA"/>
+    <w:rsid w:val="000605EF"/>
     <w:pPr>
       <w:keepNext/>
       <w:keepLines/>
@@ -1340,7 +1389,7 @@
     <w:basedOn w:val="Fuentedeprrafopredeter"/>
     <w:link w:val="Ttulo1"/>
     <w:uiPriority w:val="9"/>
-    <w:rsid w:val="00E56DCA"/>
+    <w:rsid w:val="000605EF"/>
     <w:rPr>
       <w:rFonts w:asciiTheme="majorHAnsi" w:eastAsiaTheme="majorEastAsia" w:hAnsiTheme="majorHAnsi" w:cstheme="majorBidi"/>
       <w:color w:val="0F4761" w:themeColor="accent1" w:themeShade="BF"/>
@@ -1354,7 +1403,7 @@
     <w:link w:val="Ttulo2"/>
     <w:uiPriority w:val="9"/>
     <w:semiHidden/>
-    <w:rsid w:val="00E56DCA"/>
+    <w:rsid w:val="000605EF"/>
     <w:rPr>
       <w:rFonts w:asciiTheme="majorHAnsi" w:eastAsiaTheme="majorEastAsia" w:hAnsiTheme="majorHAnsi" w:cstheme="majorBidi"/>
       <w:color w:val="0F4761" w:themeColor="accent1" w:themeShade="BF"/>
@@ -1368,7 +1417,7 @@
     <w:link w:val="Ttulo3"/>
     <w:uiPriority w:val="9"/>
     <w:semiHidden/>
-    <w:rsid w:val="00E56DCA"/>
+    <w:rsid w:val="000605EF"/>
     <w:rPr>
       <w:rFonts w:eastAsiaTheme="majorEastAsia" w:cstheme="majorBidi"/>
       <w:color w:val="0F4761" w:themeColor="accent1" w:themeShade="BF"/>
@@ -1382,7 +1431,7 @@
     <w:link w:val="Ttulo4"/>
     <w:uiPriority w:val="9"/>
     <w:semiHidden/>
-    <w:rsid w:val="00E56DCA"/>
+    <w:rsid w:val="000605EF"/>
     <w:rPr>
       <w:rFonts w:eastAsiaTheme="majorEastAsia" w:cstheme="majorBidi"/>
       <w:i/>
@@ -1396,7 +1445,7 @@
     <w:link w:val="Ttulo5"/>
     <w:uiPriority w:val="9"/>
     <w:semiHidden/>
-    <w:rsid w:val="00E56DCA"/>
+    <w:rsid w:val="000605EF"/>
     <w:rPr>
       <w:rFonts w:eastAsiaTheme="majorEastAsia" w:cstheme="majorBidi"/>
       <w:color w:val="0F4761" w:themeColor="accent1" w:themeShade="BF"/>
@@ -1408,7 +1457,7 @@
     <w:link w:val="Ttulo6"/>
     <w:uiPriority w:val="9"/>
     <w:semiHidden/>
-    <w:rsid w:val="00E56DCA"/>
+    <w:rsid w:val="000605EF"/>
     <w:rPr>
       <w:rFonts w:eastAsiaTheme="majorEastAsia" w:cstheme="majorBidi"/>
       <w:i/>
@@ -1422,7 +1471,7 @@
     <w:link w:val="Ttulo7"/>
     <w:uiPriority w:val="9"/>
     <w:semiHidden/>
-    <w:rsid w:val="00E56DCA"/>
+    <w:rsid w:val="000605EF"/>
     <w:rPr>
       <w:rFonts w:eastAsiaTheme="majorEastAsia" w:cstheme="majorBidi"/>
       <w:color w:val="595959" w:themeColor="text1" w:themeTint="A6"/>
@@ -1434,7 +1483,7 @@
     <w:link w:val="Ttulo8"/>
     <w:uiPriority w:val="9"/>
     <w:semiHidden/>
-    <w:rsid w:val="00E56DCA"/>
+    <w:rsid w:val="000605EF"/>
     <w:rPr>
       <w:rFonts w:eastAsiaTheme="majorEastAsia" w:cstheme="majorBidi"/>
       <w:i/>
@@ -1448,7 +1497,7 @@
     <w:link w:val="Ttulo9"/>
     <w:uiPriority w:val="9"/>
     <w:semiHidden/>
-    <w:rsid w:val="00E56DCA"/>
+    <w:rsid w:val="000605EF"/>
     <w:rPr>
       <w:rFonts w:eastAsiaTheme="majorEastAsia" w:cstheme="majorBidi"/>
       <w:color w:val="272727" w:themeColor="text1" w:themeTint="D8"/>
@@ -1461,7 +1510,7 @@
     <w:link w:val="TtuloCar"/>
     <w:uiPriority w:val="10"/>
     <w:qFormat/>
-    <w:rsid w:val="00E56DCA"/>
+    <w:rsid w:val="000605EF"/>
     <w:pPr>
       <w:spacing w:after="80" w:line="240" w:lineRule="auto"/>
       <w:contextualSpacing/>
@@ -1479,7 +1528,7 @@
     <w:basedOn w:val="Fuentedeprrafopredeter"/>
     <w:link w:val="Ttulo"/>
     <w:uiPriority w:val="10"/>
-    <w:rsid w:val="00E56DCA"/>
+    <w:rsid w:val="000605EF"/>
     <w:rPr>
       <w:rFonts w:asciiTheme="majorHAnsi" w:eastAsiaTheme="majorEastAsia" w:hAnsiTheme="majorHAnsi" w:cstheme="majorBidi"/>
       <w:spacing w:val="-10"/>
@@ -1495,7 +1544,7 @@
     <w:link w:val="SubttuloCar"/>
     <w:uiPriority w:val="11"/>
     <w:qFormat/>
-    <w:rsid w:val="00E56DCA"/>
+    <w:rsid w:val="000605EF"/>
     <w:pPr>
       <w:numPr>
         <w:ilvl w:val="1"/>
@@ -1514,7 +1563,7 @@
     <w:basedOn w:val="Fuentedeprrafopredeter"/>
     <w:link w:val="Subttulo"/>
     <w:uiPriority w:val="11"/>
-    <w:rsid w:val="00E56DCA"/>
+    <w:rsid w:val="000605EF"/>
     <w:rPr>
       <w:rFonts w:eastAsiaTheme="majorEastAsia" w:cstheme="majorBidi"/>
       <w:color w:val="595959" w:themeColor="text1" w:themeTint="A6"/>
@@ -1530,7 +1579,7 @@
     <w:link w:val="CitaCar"/>
     <w:uiPriority w:val="29"/>
     <w:qFormat/>
-    <w:rsid w:val="00E56DCA"/>
+    <w:rsid w:val="000605EF"/>
     <w:pPr>
       <w:spacing w:before="160"/>
       <w:jc w:val="center"/>
@@ -1546,7 +1595,7 @@
     <w:basedOn w:val="Fuentedeprrafopredeter"/>
     <w:link w:val="Cita"/>
     <w:uiPriority w:val="29"/>
-    <w:rsid w:val="00E56DCA"/>
+    <w:rsid w:val="000605EF"/>
     <w:rPr>
       <w:i/>
       <w:iCs/>
@@ -1558,7 +1607,7 @@
     <w:basedOn w:val="Normal"/>
     <w:uiPriority w:val="34"/>
     <w:qFormat/>
-    <w:rsid w:val="00E56DCA"/>
+    <w:rsid w:val="000605EF"/>
     <w:pPr>
       <w:ind w:left="720"/>
       <w:contextualSpacing/>
@@ -1569,7 +1618,7 @@
     <w:basedOn w:val="Fuentedeprrafopredeter"/>
     <w:uiPriority w:val="21"/>
     <w:qFormat/>
-    <w:rsid w:val="00E56DCA"/>
+    <w:rsid w:val="000605EF"/>
     <w:rPr>
       <w:i/>
       <w:iCs/>
@@ -1583,7 +1632,7 @@
     <w:link w:val="CitadestacadaCar"/>
     <w:uiPriority w:val="30"/>
     <w:qFormat/>
-    <w:rsid w:val="00E56DCA"/>
+    <w:rsid w:val="000605EF"/>
     <w:pPr>
       <w:pBdr>
         <w:top w:val="single" w:sz="4" w:space="10" w:color="0F4761" w:themeColor="accent1" w:themeShade="BF"/>
@@ -1604,7 +1653,7 @@
     <w:basedOn w:val="Fuentedeprrafopredeter"/>
     <w:link w:val="Citadestacada"/>
     <w:uiPriority w:val="30"/>
-    <w:rsid w:val="00E56DCA"/>
+    <w:rsid w:val="000605EF"/>
     <w:rPr>
       <w:i/>
       <w:iCs/>
@@ -1616,7 +1665,7 @@
     <w:basedOn w:val="Fuentedeprrafopredeter"/>
     <w:uiPriority w:val="32"/>
     <w:qFormat/>
-    <w:rsid w:val="00E56DCA"/>
+    <w:rsid w:val="000605EF"/>
     <w:rPr>
       <w:b/>
       <w:bCs/>

</xml_diff>

<commit_message>
docs: replace Jenkins log extract with Pipeline Overview capture
</commit_message>
<xml_diff>
--- a/docs/Actividad_1_Laboratorio_Tecnico.docx
+++ b/docs/Actividad_1_Laboratorio_Tecnico.docx
@@ -409,7 +409,7 @@
           <w:rFonts w:ascii="Aptos" w:hAnsi="Aptos"/>
           <w:sz w:val="22"/>
         </w:rPr>
-        <w:t>La ejecucion Jenkins #7 documentada durante la practica termino en `SUCCESS`: ejecuto las etapas de checkout, dependencias, analisis estatico, pruebas unitarias, build Docker, validacion Helm, publicacion de imagen y actualizacion GitOps. Adicionalmente, la ejecucion GitHub Actions `33335315017` del 30 de agosto de 2026 finalizo exitosamente con los jobs `lint`, `test`, `docker-build-validation`, `snyk` y `sonarcloud`, y publico el artefacto descargable `snyk-report`. La evidencia operativa y las capturas propias estan consolidadas en `docs/EVIDENCIA_OPERATIVA.md`.</w:t>
+        <w:t>La ejecucion Jenkins #7 documentada durante la practica termino en `SUCCESS`: la captura autenticada de Pipeline Overview muestra aprobados los stages de checkout, dependencias, analisis estatico, pruebas unitarias, build Docker, validacion Helm, publicacion de imagen y actualizacion GitOps. Adicionalmente, la ejecucion GitHub Actions `33335315017` del 30 de agosto de 2026 finalizo exitosamente con los jobs `lint`, `test`, `docker-build-validation`, `snyk` y `sonarcloud`, y publico el artefacto descargable `snyk-report`. La evidencia operativa y las capturas propias estan consolidadas en `docs/EVIDENCIA_OPERATIVA.md`.</w:t>
       </w:r>
     </w:p>
     <w:p>
@@ -626,75 +626,26 @@
         <w:pStyle w:val="Ttulo1"/>
       </w:pPr>
       <w:r>
-        <w:t>Evidencia visual: GitHub Actions, SonarCloud y Snyk</w:t>
-      </w:r>
-    </w:p>
-    <w:p/>
-    <w:p/>
-    <w:p>
-      <w:pPr>
-        <w:pStyle w:val="Ttulo1"/>
+        <w:lastRenderedPageBreak/>
+        <w:t>Evidencia visual: dashboard Grafana activo</w:t>
+      </w:r>
+    </w:p>
+    <w:p>
+      <w:r>
         <w:rPr>
           <w:noProof/>
         </w:rPr>
-      </w:pPr>
-      <w:r>
-        <w:rPr>
-          <w:noProof/>
-        </w:rPr>
-        <w:t>Evidencia visual: Quality Gate de SonarQube Cloud</w:t>
-      </w:r>
-    </w:p>
-    <w:p/>
-    <w:p/>
-    <w:p>
-      <w:pPr>
-        <w:pStyle w:val="Ttulo1"/>
-        <w:rPr>
-          <w:noProof/>
-        </w:rPr>
-      </w:pPr>
-      <w:r>
-        <w:rPr>
-          <w:noProof/>
-        </w:rPr>
-        <w:t>Evidencia visual: target Prometheus en estado UP</w:t>
-      </w:r>
-    </w:p>
-    <w:p/>
-    <w:p/>
-    <w:p>
-      <w:pPr>
-        <w:pStyle w:val="Ttulo1"/>
-        <w:rPr>
-          <w:noProof/>
-        </w:rPr>
-      </w:pPr>
-      <w:r>
-        <w:rPr>
-          <w:noProof/>
-        </w:rPr>
-        <w:t>Evidencia visual: dashboard Grafana activo</w:t>
-      </w:r>
-    </w:p>
-    <w:p/>
-    <w:p/>
-    <w:p>
-      <w:r>
-        <w:rPr>
-          <w:noProof/>
-        </w:rPr>
         <w:drawing>
-          <wp:inline distT="0" distB="0" distL="0" distR="0" wp14:anchorId="3EE88740" wp14:editId="2F4FE180">
+          <wp:inline distT="0" distB="0" distL="0" distR="0" wp14:anchorId="19B91B94" wp14:editId="0FB45676">
             <wp:extent cx="5842000" cy="3302000"/>
             <wp:effectExtent l="0" t="0" r="6350" b="0"/>
-            <wp:docPr id="1212623055" name="Imagen 4"/>
+            <wp:docPr id="83047676" name="Imagen 1"/>
             <wp:cNvGraphicFramePr/>
             <a:graphic xmlns:a="http://schemas.openxmlformats.org/drawingml/2006/main">
               <a:graphicData uri="http://schemas.openxmlformats.org/drawingml/2006/picture">
                 <pic:pic xmlns:pic="http://schemas.openxmlformats.org/drawingml/2006/picture">
                   <pic:nvPicPr>
-                    <pic:cNvPr id="1212623055" name=""/>
+                    <pic:cNvPr id="83047676" name=""/>
                     <pic:cNvPicPr/>
                   </pic:nvPicPr>
                   <pic:blipFill>
@@ -738,7 +689,7 @@
 <file path=word/numbering.xml><?xml version="1.0" encoding="utf-8"?>
 <w:numbering xmlns:wpc="http://schemas.microsoft.com/office/word/2010/wordprocessingCanvas" xmlns:cx="http://schemas.microsoft.com/office/drawing/2014/chartex" xmlns:cx1="http://schemas.microsoft.com/office/drawing/2015/9/8/chartex" xmlns:cx2="http://schemas.microsoft.com/office/drawing/2015/10/21/chartex" xmlns:cx3="http://schemas.microsoft.com/office/drawing/2016/5/9/chartex" xmlns:cx4="http://schemas.microsoft.com/office/drawing/2016/5/10/chartex" xmlns:cx5="http://schemas.microsoft.com/office/drawing/2016/5/11/chartex" xmlns:cx6="http://schemas.microsoft.com/office/drawing/2016/5/12/chartex" xmlns:cx7="http://schemas.microsoft.com/office/drawing/2016/5/13/chartex" xmlns:cx8="http://schemas.microsoft.com/office/drawing/2016/5/14/chartex" xmlns:mc="http://schemas.openxmlformats.org/markup-compatibility/2006" xmlns:aink="http://schemas.microsoft.com/office/drawing/2016/ink" xmlns:am3d="http://schemas.microsoft.com/office/drawing/2017/model3d" xmlns:o="urn:schemas-microsoft-com:office:office" xmlns:oel="http://schemas.microsoft.com/office/2019/extlst" xmlns:r="http://schemas.openxmlformats.org/officeDocument/2006/relationships" xmlns:m="http://schemas.openxmlformats.org/officeDocument/2006/math" xmlns:v="urn:schemas-microsoft-com:vml" xmlns:wp14="http://schemas.microsoft.com/office/word/2010/wordprocessingDrawing" xmlns:wp="http://schemas.openxmlformats.org/drawingml/2006/wordprocessingDrawing" xmlns:w10="urn:schemas-microsoft-com:office:word" xmlns:w="http://schemas.openxmlformats.org/wordprocessingml/2006/main" xmlns:w14="http://schemas.microsoft.com/office/word/2010/wordml" xmlns:w15="http://schemas.microsoft.com/office/word/2012/wordml" xmlns:w16cex="http://schemas.microsoft.com/office/word/2018/wordml/cex" xmlns:w16cid="http://schemas.microsoft.com/office/word/2016/wordml/cid" xmlns:w16="http://schemas.microsoft.com/office/word/2018/wordml" xmlns:w16du="http://schemas.microsoft.com/office/word/2023/wordml/word16du" xmlns:w16sdtdh="http://schemas.microsoft.com/office/word/2020/wordml/sdtdatahash" xmlns:w16sdtfl="http://schemas.microsoft.com/office/word/2024/wordml/sdtformatlock" xmlns:w16se="http://schemas.microsoft.com/office/word/2015/wordml/symex" xmlns:wpg="http://schemas.microsoft.com/office/word/2010/wordprocessingGroup" xmlns:wpi="http://schemas.microsoft.com/office/word/2010/wordprocessingInk" xmlns:wne="http://schemas.microsoft.com/office/word/2006/wordml" xmlns:wps="http://schemas.microsoft.com/office/word/2010/wordprocessingShape" mc:Ignorable="w14 w15 w16se w16cid w16 w16cex w16sdtdh w16sdtfl w16du wp14">
   <w:abstractNum w:abstractNumId="0" w15:restartNumberingAfterBreak="0">
-    <w:nsid w:val="42B736ED"/>
+    <w:nsid w:val="629547A8"/>
     <w:multiLevelType w:val="singleLevel"/>
     <w:tmpl w:val="580A000F"/>
     <w:lvl w:ilvl="0">
@@ -751,7 +702,7 @@
       </w:pPr>
     </w:lvl>
   </w:abstractNum>
-  <w:num w:numId="1" w16cid:durableId="1509713568">
+  <w:num w:numId="1" w16cid:durableId="393282128">
     <w:abstractNumId w:val="0"/>
   </w:num>
 </w:numbering>
@@ -1165,7 +1116,7 @@
     <w:link w:val="Ttulo1Car"/>
     <w:uiPriority w:val="9"/>
     <w:qFormat/>
-    <w:rsid w:val="000605EF"/>
+    <w:rsid w:val="005C48F3"/>
     <w:pPr>
       <w:keepNext/>
       <w:keepLines/>
@@ -1188,7 +1139,7 @@
     <w:semiHidden/>
     <w:unhideWhenUsed/>
     <w:qFormat/>
-    <w:rsid w:val="000605EF"/>
+    <w:rsid w:val="005C48F3"/>
     <w:pPr>
       <w:keepNext/>
       <w:keepLines/>
@@ -1211,7 +1162,7 @@
     <w:semiHidden/>
     <w:unhideWhenUsed/>
     <w:qFormat/>
-    <w:rsid w:val="000605EF"/>
+    <w:rsid w:val="005C48F3"/>
     <w:pPr>
       <w:keepNext/>
       <w:keepLines/>
@@ -1234,7 +1185,7 @@
     <w:semiHidden/>
     <w:unhideWhenUsed/>
     <w:qFormat/>
-    <w:rsid w:val="000605EF"/>
+    <w:rsid w:val="005C48F3"/>
     <w:pPr>
       <w:keepNext/>
       <w:keepLines/>
@@ -1257,7 +1208,7 @@
     <w:semiHidden/>
     <w:unhideWhenUsed/>
     <w:qFormat/>
-    <w:rsid w:val="000605EF"/>
+    <w:rsid w:val="005C48F3"/>
     <w:pPr>
       <w:keepNext/>
       <w:keepLines/>
@@ -1278,7 +1229,7 @@
     <w:semiHidden/>
     <w:unhideWhenUsed/>
     <w:qFormat/>
-    <w:rsid w:val="000605EF"/>
+    <w:rsid w:val="005C48F3"/>
     <w:pPr>
       <w:keepNext/>
       <w:keepLines/>
@@ -1301,7 +1252,7 @@
     <w:semiHidden/>
     <w:unhideWhenUsed/>
     <w:qFormat/>
-    <w:rsid w:val="000605EF"/>
+    <w:rsid w:val="005C48F3"/>
     <w:pPr>
       <w:keepNext/>
       <w:keepLines/>
@@ -1322,7 +1273,7 @@
     <w:semiHidden/>
     <w:unhideWhenUsed/>
     <w:qFormat/>
-    <w:rsid w:val="000605EF"/>
+    <w:rsid w:val="005C48F3"/>
     <w:pPr>
       <w:keepNext/>
       <w:keepLines/>
@@ -1345,7 +1296,7 @@
     <w:semiHidden/>
     <w:unhideWhenUsed/>
     <w:qFormat/>
-    <w:rsid w:val="000605EF"/>
+    <w:rsid w:val="005C48F3"/>
     <w:pPr>
       <w:keepNext/>
       <w:keepLines/>
@@ -1389,7 +1340,7 @@
     <w:basedOn w:val="Fuentedeprrafopredeter"/>
     <w:link w:val="Ttulo1"/>
     <w:uiPriority w:val="9"/>
-    <w:rsid w:val="000605EF"/>
+    <w:rsid w:val="005C48F3"/>
     <w:rPr>
       <w:rFonts w:asciiTheme="majorHAnsi" w:eastAsiaTheme="majorEastAsia" w:hAnsiTheme="majorHAnsi" w:cstheme="majorBidi"/>
       <w:color w:val="0F4761" w:themeColor="accent1" w:themeShade="BF"/>
@@ -1403,7 +1354,7 @@
     <w:link w:val="Ttulo2"/>
     <w:uiPriority w:val="9"/>
     <w:semiHidden/>
-    <w:rsid w:val="000605EF"/>
+    <w:rsid w:val="005C48F3"/>
     <w:rPr>
       <w:rFonts w:asciiTheme="majorHAnsi" w:eastAsiaTheme="majorEastAsia" w:hAnsiTheme="majorHAnsi" w:cstheme="majorBidi"/>
       <w:color w:val="0F4761" w:themeColor="accent1" w:themeShade="BF"/>
@@ -1417,7 +1368,7 @@
     <w:link w:val="Ttulo3"/>
     <w:uiPriority w:val="9"/>
     <w:semiHidden/>
-    <w:rsid w:val="000605EF"/>
+    <w:rsid w:val="005C48F3"/>
     <w:rPr>
       <w:rFonts w:eastAsiaTheme="majorEastAsia" w:cstheme="majorBidi"/>
       <w:color w:val="0F4761" w:themeColor="accent1" w:themeShade="BF"/>
@@ -1431,7 +1382,7 @@
     <w:link w:val="Ttulo4"/>
     <w:uiPriority w:val="9"/>
     <w:semiHidden/>
-    <w:rsid w:val="000605EF"/>
+    <w:rsid w:val="005C48F3"/>
     <w:rPr>
       <w:rFonts w:eastAsiaTheme="majorEastAsia" w:cstheme="majorBidi"/>
       <w:i/>
@@ -1445,7 +1396,7 @@
     <w:link w:val="Ttulo5"/>
     <w:uiPriority w:val="9"/>
     <w:semiHidden/>
-    <w:rsid w:val="000605EF"/>
+    <w:rsid w:val="005C48F3"/>
     <w:rPr>
       <w:rFonts w:eastAsiaTheme="majorEastAsia" w:cstheme="majorBidi"/>
       <w:color w:val="0F4761" w:themeColor="accent1" w:themeShade="BF"/>
@@ -1457,7 +1408,7 @@
     <w:link w:val="Ttulo6"/>
     <w:uiPriority w:val="9"/>
     <w:semiHidden/>
-    <w:rsid w:val="000605EF"/>
+    <w:rsid w:val="005C48F3"/>
     <w:rPr>
       <w:rFonts w:eastAsiaTheme="majorEastAsia" w:cstheme="majorBidi"/>
       <w:i/>
@@ -1471,7 +1422,7 @@
     <w:link w:val="Ttulo7"/>
     <w:uiPriority w:val="9"/>
     <w:semiHidden/>
-    <w:rsid w:val="000605EF"/>
+    <w:rsid w:val="005C48F3"/>
     <w:rPr>
       <w:rFonts w:eastAsiaTheme="majorEastAsia" w:cstheme="majorBidi"/>
       <w:color w:val="595959" w:themeColor="text1" w:themeTint="A6"/>
@@ -1483,7 +1434,7 @@
     <w:link w:val="Ttulo8"/>
     <w:uiPriority w:val="9"/>
     <w:semiHidden/>
-    <w:rsid w:val="000605EF"/>
+    <w:rsid w:val="005C48F3"/>
     <w:rPr>
       <w:rFonts w:eastAsiaTheme="majorEastAsia" w:cstheme="majorBidi"/>
       <w:i/>
@@ -1497,7 +1448,7 @@
     <w:link w:val="Ttulo9"/>
     <w:uiPriority w:val="9"/>
     <w:semiHidden/>
-    <w:rsid w:val="000605EF"/>
+    <w:rsid w:val="005C48F3"/>
     <w:rPr>
       <w:rFonts w:eastAsiaTheme="majorEastAsia" w:cstheme="majorBidi"/>
       <w:color w:val="272727" w:themeColor="text1" w:themeTint="D8"/>
@@ -1510,7 +1461,7 @@
     <w:link w:val="TtuloCar"/>
     <w:uiPriority w:val="10"/>
     <w:qFormat/>
-    <w:rsid w:val="000605EF"/>
+    <w:rsid w:val="005C48F3"/>
     <w:pPr>
       <w:spacing w:after="80" w:line="240" w:lineRule="auto"/>
       <w:contextualSpacing/>
@@ -1528,7 +1479,7 @@
     <w:basedOn w:val="Fuentedeprrafopredeter"/>
     <w:link w:val="Ttulo"/>
     <w:uiPriority w:val="10"/>
-    <w:rsid w:val="000605EF"/>
+    <w:rsid w:val="005C48F3"/>
     <w:rPr>
       <w:rFonts w:asciiTheme="majorHAnsi" w:eastAsiaTheme="majorEastAsia" w:hAnsiTheme="majorHAnsi" w:cstheme="majorBidi"/>
       <w:spacing w:val="-10"/>
@@ -1544,7 +1495,7 @@
     <w:link w:val="SubttuloCar"/>
     <w:uiPriority w:val="11"/>
     <w:qFormat/>
-    <w:rsid w:val="000605EF"/>
+    <w:rsid w:val="005C48F3"/>
     <w:pPr>
       <w:numPr>
         <w:ilvl w:val="1"/>
@@ -1563,7 +1514,7 @@
     <w:basedOn w:val="Fuentedeprrafopredeter"/>
     <w:link w:val="Subttulo"/>
     <w:uiPriority w:val="11"/>
-    <w:rsid w:val="000605EF"/>
+    <w:rsid w:val="005C48F3"/>
     <w:rPr>
       <w:rFonts w:eastAsiaTheme="majorEastAsia" w:cstheme="majorBidi"/>
       <w:color w:val="595959" w:themeColor="text1" w:themeTint="A6"/>
@@ -1579,7 +1530,7 @@
     <w:link w:val="CitaCar"/>
     <w:uiPriority w:val="29"/>
     <w:qFormat/>
-    <w:rsid w:val="000605EF"/>
+    <w:rsid w:val="005C48F3"/>
     <w:pPr>
       <w:spacing w:before="160"/>
       <w:jc w:val="center"/>
@@ -1595,7 +1546,7 @@
     <w:basedOn w:val="Fuentedeprrafopredeter"/>
     <w:link w:val="Cita"/>
     <w:uiPriority w:val="29"/>
-    <w:rsid w:val="000605EF"/>
+    <w:rsid w:val="005C48F3"/>
     <w:rPr>
       <w:i/>
       <w:iCs/>
@@ -1607,7 +1558,7 @@
     <w:basedOn w:val="Normal"/>
     <w:uiPriority w:val="34"/>
     <w:qFormat/>
-    <w:rsid w:val="000605EF"/>
+    <w:rsid w:val="005C48F3"/>
     <w:pPr>
       <w:ind w:left="720"/>
       <w:contextualSpacing/>
@@ -1618,7 +1569,7 @@
     <w:basedOn w:val="Fuentedeprrafopredeter"/>
     <w:uiPriority w:val="21"/>
     <w:qFormat/>
-    <w:rsid w:val="000605EF"/>
+    <w:rsid w:val="005C48F3"/>
     <w:rPr>
       <w:i/>
       <w:iCs/>
@@ -1632,7 +1583,7 @@
     <w:link w:val="CitadestacadaCar"/>
     <w:uiPriority w:val="30"/>
     <w:qFormat/>
-    <w:rsid w:val="000605EF"/>
+    <w:rsid w:val="005C48F3"/>
     <w:pPr>
       <w:pBdr>
         <w:top w:val="single" w:sz="4" w:space="10" w:color="0F4761" w:themeColor="accent1" w:themeShade="BF"/>
@@ -1653,7 +1604,7 @@
     <w:basedOn w:val="Fuentedeprrafopredeter"/>
     <w:link w:val="Citadestacada"/>
     <w:uiPriority w:val="30"/>
-    <w:rsid w:val="000605EF"/>
+    <w:rsid w:val="005C48F3"/>
     <w:rPr>
       <w:i/>
       <w:iCs/>
@@ -1665,7 +1616,7 @@
     <w:basedOn w:val="Fuentedeprrafopredeter"/>
     <w:uiPriority w:val="32"/>
     <w:qFormat/>
-    <w:rsid w:val="000605EF"/>
+    <w:rsid w:val="005C48F3"/>
     <w:rPr>
       <w:b/>
       <w:bCs/>

</xml_diff>

<commit_message>
docs: apply APA format and attach execution evidence
</commit_message>
<xml_diff>
--- a/docs/Actividad_1_Laboratorio_Tecnico.docx
+++ b/docs/Actividad_1_Laboratorio_Tecnico.docx
@@ -13,22 +13,19 @@
     <w:p>
       <w:pPr>
         <w:rPr>
-          <w:rFonts w:ascii="Aptos" w:hAnsi="Aptos"/>
-          <w:sz w:val="22"/>
-        </w:rPr>
-      </w:pPr>
-    </w:p>
-    <w:p>
-      <w:pPr>
-        <w:rPr>
-          <w:rFonts w:ascii="Aptos" w:hAnsi="Aptos"/>
-          <w:sz w:val="22"/>
-        </w:rPr>
-      </w:pPr>
-      <w:r>
-        <w:rPr>
-          <w:rFonts w:ascii="Aptos" w:hAnsi="Aptos"/>
-          <w:sz w:val="22"/>
+          <w:rFonts w:cs="Times New Roman"/>
+        </w:rPr>
+      </w:pPr>
+    </w:p>
+    <w:p>
+      <w:pPr>
+        <w:rPr>
+          <w:rFonts w:cs="Times New Roman"/>
+        </w:rPr>
+      </w:pPr>
+      <w:r>
+        <w:rPr>
+          <w:rFonts w:cs="Times New Roman"/>
         </w:rPr>
         <w:t xml:space="preserve">**Autores:** Manuel Fernando Santofimio Tovar y Beycy Yuliet Rojas Acero  </w:t>
       </w:r>
@@ -36,14 +33,12 @@
     <w:p>
       <w:pPr>
         <w:rPr>
-          <w:rFonts w:ascii="Aptos" w:hAnsi="Aptos"/>
-          <w:sz w:val="22"/>
-        </w:rPr>
-      </w:pPr>
-      <w:r>
-        <w:rPr>
-          <w:rFonts w:ascii="Aptos" w:hAnsi="Aptos"/>
-          <w:sz w:val="22"/>
+          <w:rFonts w:cs="Times New Roman"/>
+        </w:rPr>
+      </w:pPr>
+      <w:r>
+        <w:rPr>
+          <w:rFonts w:cs="Times New Roman"/>
         </w:rPr>
         <w:t>**Repositorio:** https://github.com/yuliet719-beep/mi-microservicio</w:t>
       </w:r>
@@ -51,63 +46,79 @@
     <w:p>
       <w:pPr>
         <w:rPr>
-          <w:rFonts w:ascii="Aptos" w:hAnsi="Aptos"/>
-          <w:sz w:val="22"/>
+          <w:rFonts w:cs="Times New Roman"/>
         </w:rPr>
       </w:pPr>
     </w:p>
     <w:p>
       <w:pPr>
         <w:pStyle w:val="Ttulo1"/>
-      </w:pPr>
-      <w:r>
+        <w:jc w:val="center"/>
+        <w:rPr>
+          <w:rFonts w:ascii="Times New Roman" w:hAnsi="Times New Roman" w:cs="Times New Roman"/>
+          <w:b/>
+          <w:sz w:val="24"/>
+        </w:rPr>
+      </w:pPr>
+      <w:r>
+        <w:rPr>
+          <w:rFonts w:ascii="Times New Roman" w:hAnsi="Times New Roman" w:cs="Times New Roman"/>
+          <w:b/>
+          <w:sz w:val="24"/>
+        </w:rPr>
         <w:t>Objetivo</w:t>
       </w:r>
     </w:p>
     <w:p>
       <w:pPr>
         <w:rPr>
-          <w:rFonts w:ascii="Aptos" w:hAnsi="Aptos"/>
-          <w:sz w:val="22"/>
-        </w:rPr>
-      </w:pPr>
-    </w:p>
-    <w:p>
-      <w:pPr>
-        <w:rPr>
-          <w:rFonts w:ascii="Aptos" w:hAnsi="Aptos"/>
-          <w:sz w:val="22"/>
-        </w:rPr>
-      </w:pPr>
-      <w:r>
-        <w:rPr>
-          <w:rFonts w:ascii="Aptos" w:hAnsi="Aptos"/>
-          <w:sz w:val="22"/>
-        </w:rPr>
-        <w:t>Implementar un flujo CI/CD para un microservicio FastAPI que integre validacion de calidad, pruebas, seguridad, empaquetado Docker, despliegue declarativo y observabilidad. La solucion evita que el pipeline escriba directamente sobre Kubernetes: Jenkins actualiza el estado deseado en Git y Argo CD realiza la sincronizacion.</w:t>
-      </w:r>
-    </w:p>
-    <w:p>
-      <w:pPr>
-        <w:rPr>
-          <w:rFonts w:ascii="Aptos" w:hAnsi="Aptos"/>
-          <w:sz w:val="22"/>
+          <w:rFonts w:cs="Times New Roman"/>
+        </w:rPr>
+      </w:pPr>
+    </w:p>
+    <w:p>
+      <w:pPr>
+        <w:rPr>
+          <w:rFonts w:cs="Times New Roman"/>
+        </w:rPr>
+      </w:pPr>
+      <w:r>
+        <w:rPr>
+          <w:rFonts w:cs="Times New Roman"/>
+        </w:rPr>
+        <w:t>Implementar un flujo CI/CD para un microservicio FastAPI que integre validacion de calidad, pruebas, seguridad, empaquetado Docker, despliegue declarativo y observabilidad. La solucion evita que el pipeline escriba directamente sobre Kubernetes: Jenkins actualiza el estado deseado en Git y Argo CD realiza la sincronizacion. Este enfoque aplica la separacion entre construccion, pruebas y despliegue recomendada para entregas confiables (Humble &amp; Farley, 2010).</w:t>
+      </w:r>
+    </w:p>
+    <w:p>
+      <w:pPr>
+        <w:rPr>
+          <w:rFonts w:cs="Times New Roman"/>
         </w:rPr>
       </w:pPr>
     </w:p>
     <w:p>
       <w:pPr>
         <w:pStyle w:val="Ttulo1"/>
-      </w:pPr>
-      <w:r>
+        <w:jc w:val="center"/>
+        <w:rPr>
+          <w:rFonts w:ascii="Times New Roman" w:hAnsi="Times New Roman" w:cs="Times New Roman"/>
+          <w:b/>
+          <w:sz w:val="24"/>
+        </w:rPr>
+      </w:pPr>
+      <w:r>
+        <w:rPr>
+          <w:rFonts w:ascii="Times New Roman" w:hAnsi="Times New Roman" w:cs="Times New Roman"/>
+          <w:b/>
+          <w:sz w:val="24"/>
+        </w:rPr>
         <w:t>Arquitectura y flujo</w:t>
       </w:r>
     </w:p>
     <w:p>
       <w:pPr>
         <w:rPr>
-          <w:rFonts w:ascii="Aptos" w:hAnsi="Aptos"/>
-          <w:sz w:val="22"/>
+          <w:rFonts w:cs="Times New Roman"/>
         </w:rPr>
       </w:pPr>
     </w:p>
@@ -119,14 +130,12 @@
           <w:numId w:val="1"/>
         </w:numPr>
         <w:rPr>
-          <w:rFonts w:ascii="Aptos" w:hAnsi="Aptos"/>
-          <w:sz w:val="22"/>
-        </w:rPr>
-      </w:pPr>
-      <w:r>
-        <w:rPr>
-          <w:rFonts w:ascii="Aptos" w:hAnsi="Aptos"/>
-          <w:sz w:val="22"/>
+          <w:rFonts w:cs="Times New Roman"/>
+        </w:rPr>
+      </w:pPr>
+      <w:r>
+        <w:rPr>
+          <w:rFonts w:cs="Times New Roman"/>
         </w:rPr>
         <w:t>Un `push` o `pull_request` sobre `main` inicia GitHub Actions.</w:t>
       </w:r>
@@ -135,14 +144,12 @@
       <w:pPr>
         <w:ind w:left="360"/>
         <w:rPr>
-          <w:rFonts w:ascii="Aptos" w:hAnsi="Aptos"/>
-          <w:sz w:val="22"/>
-        </w:rPr>
-      </w:pPr>
-      <w:r>
-        <w:rPr>
-          <w:rFonts w:ascii="Aptos" w:hAnsi="Aptos"/>
-          <w:sz w:val="22"/>
+          <w:rFonts w:cs="Times New Roman"/>
+        </w:rPr>
+      </w:pPr>
+      <w:r>
+        <w:rPr>
+          <w:rFonts w:cs="Times New Roman"/>
         </w:rPr>
         <w:t>Los jobs `lint`, `test` y `docker-build-validation` validan estilo, comportamiento y construccion del artefacto.</w:t>
       </w:r>
@@ -155,14 +162,12 @@
           <w:numId w:val="1"/>
         </w:numPr>
         <w:rPr>
-          <w:rFonts w:ascii="Aptos" w:hAnsi="Aptos"/>
-          <w:sz w:val="22"/>
-        </w:rPr>
-      </w:pPr>
-      <w:r>
-        <w:rPr>
-          <w:rFonts w:ascii="Aptos" w:hAnsi="Aptos"/>
-          <w:sz w:val="22"/>
+          <w:rFonts w:cs="Times New Roman"/>
+        </w:rPr>
+      </w:pPr>
+      <w:r>
+        <w:rPr>
+          <w:rFonts w:cs="Times New Roman"/>
         </w:rPr>
         <w:t>Los jobs `sonarcloud` y `snyk` analizan calidad y dependencias con resultados visibles en la ejecucion de Actions.</w:t>
       </w:r>
@@ -171,15 +176,14 @@
       <w:pPr>
         <w:ind w:left="360"/>
         <w:rPr>
-          <w:rFonts w:ascii="Aptos" w:hAnsi="Aptos"/>
-          <w:sz w:val="22"/>
-        </w:rPr>
-      </w:pPr>
-      <w:r>
-        <w:rPr>
-          <w:rFonts w:ascii="Aptos" w:hAnsi="Aptos"/>
-          <w:sz w:val="22"/>
-        </w:rPr>
+          <w:rFonts w:cs="Times New Roman"/>
+        </w:rPr>
+      </w:pPr>
+      <w:r>
+        <w:rPr>
+          <w:rFonts w:cs="Times New Roman"/>
+        </w:rPr>
+        <w:lastRenderedPageBreak/>
         <w:t>Jenkins ejecuta checkout, dependencias, analisis estatico, pruebas, build Docker, `helm lint`, publicacion en Docker Hub y actualizacion GitOps.</w:t>
       </w:r>
     </w:p>
@@ -191,14 +195,12 @@
           <w:numId w:val="1"/>
         </w:numPr>
         <w:rPr>
-          <w:rFonts w:ascii="Aptos" w:hAnsi="Aptos"/>
-          <w:sz w:val="22"/>
-        </w:rPr>
-      </w:pPr>
-      <w:r>
-        <w:rPr>
-          <w:rFonts w:ascii="Aptos" w:hAnsi="Aptos"/>
-          <w:sz w:val="22"/>
+          <w:rFonts w:cs="Times New Roman"/>
+        </w:rPr>
+      </w:pPr>
+      <w:r>
+        <w:rPr>
+          <w:rFonts w:cs="Times New Roman"/>
         </w:rPr>
         <w:t>El commit automatico en `helm/values-dev.yaml` incluye `[skip jenkins]` para impedir bucles de ejecucion.</w:t>
       </w:r>
@@ -207,14 +209,12 @@
       <w:pPr>
         <w:ind w:left="360"/>
         <w:rPr>
-          <w:rFonts w:ascii="Aptos" w:hAnsi="Aptos"/>
-          <w:sz w:val="22"/>
-        </w:rPr>
-      </w:pPr>
-      <w:r>
-        <w:rPr>
-          <w:rFonts w:ascii="Aptos" w:hAnsi="Aptos"/>
-          <w:sz w:val="22"/>
+          <w:rFonts w:cs="Times New Roman"/>
+        </w:rPr>
+      </w:pPr>
+      <w:r>
+        <w:rPr>
+          <w:rFonts w:cs="Times New Roman"/>
         </w:rPr>
         <w:t>Argo CD observa el repositorio, renderiza el chart Helm y sincroniza el estado en Kubernetes con `prune` y `selfHeal`.</w:t>
       </w:r>
@@ -227,14 +227,12 @@
           <w:numId w:val="1"/>
         </w:numPr>
         <w:rPr>
-          <w:rFonts w:ascii="Aptos" w:hAnsi="Aptos"/>
-          <w:sz w:val="22"/>
-        </w:rPr>
-      </w:pPr>
-      <w:r>
-        <w:rPr>
-          <w:rFonts w:ascii="Aptos" w:hAnsi="Aptos"/>
-          <w:sz w:val="22"/>
+          <w:rFonts w:cs="Times New Roman"/>
+        </w:rPr>
+      </w:pPr>
+      <w:r>
+        <w:rPr>
+          <w:rFonts w:cs="Times New Roman"/>
         </w:rPr>
         <w:t>Prometheus consulta `/metrics`; Grafana visualiza la disponibilidad, CPU, memoria y tasa de solicitudes.</w:t>
       </w:r>
@@ -247,167 +245,157 @@
           <w:numId w:val="1"/>
         </w:numPr>
         <w:rPr>
-          <w:rFonts w:ascii="Aptos" w:hAnsi="Aptos"/>
-          <w:sz w:val="22"/>
+          <w:rFonts w:cs="Times New Roman"/>
         </w:rPr>
       </w:pPr>
     </w:p>
     <w:p>
       <w:pPr>
         <w:pStyle w:val="Ttulo1"/>
-      </w:pPr>
-      <w:r>
+        <w:jc w:val="center"/>
+        <w:rPr>
+          <w:rFonts w:ascii="Times New Roman" w:hAnsi="Times New Roman" w:cs="Times New Roman"/>
+          <w:b/>
+          <w:sz w:val="24"/>
+        </w:rPr>
+      </w:pPr>
+      <w:r>
+        <w:rPr>
+          <w:rFonts w:ascii="Times New Roman" w:hAnsi="Times New Roman" w:cs="Times New Roman"/>
+          <w:b/>
+          <w:sz w:val="24"/>
+        </w:rPr>
+        <w:t>Evidencias tecnicas</w:t>
+      </w:r>
+    </w:p>
+    <w:p>
+      <w:pPr>
+        <w:rPr>
+          <w:rFonts w:cs="Times New Roman"/>
+        </w:rPr>
+      </w:pPr>
+    </w:p>
+    <w:p>
+      <w:pPr>
+        <w:rPr>
+          <w:rFonts w:cs="Times New Roman"/>
+        </w:rPr>
+      </w:pPr>
+      <w:r>
+        <w:rPr>
+          <w:rFonts w:cs="Times New Roman"/>
+        </w:rPr>
+        <w:t>| Requisito | Implementacion | Evidencia verificable |</w:t>
+      </w:r>
+    </w:p>
+    <w:p>
+      <w:pPr>
+        <w:rPr>
+          <w:rFonts w:cs="Times New Roman"/>
+        </w:rPr>
+      </w:pPr>
+      <w:r>
+        <w:rPr>
+          <w:rFonts w:cs="Times New Roman"/>
+        </w:rPr>
+        <w:t>| --- | --- | --- |</w:t>
+      </w:r>
+    </w:p>
+    <w:p>
+      <w:pPr>
+        <w:rPr>
+          <w:rFonts w:cs="Times New Roman"/>
+        </w:rPr>
+      </w:pPr>
+      <w:r>
+        <w:rPr>
+          <w:rFonts w:cs="Times New Roman"/>
+        </w:rPr>
+        <w:t>| CI/CD automatizado | `.github/workflows/ci.yml` y `Jenkinsfile` | Jobs independientes de GitHub Actions y ocho stages en Jenkins. |</w:t>
+      </w:r>
+    </w:p>
+    <w:p>
+      <w:pPr>
+        <w:rPr>
+          <w:rFonts w:cs="Times New Roman"/>
+        </w:rPr>
+      </w:pPr>
+      <w:r>
+        <w:rPr>
+          <w:rFonts w:cs="Times New Roman"/>
+        </w:rPr>
+        <w:t>| Calidad | `flake8` y `pytest` | El pipeline ejecuta `flake8 app tests` y `pytest tests -v`; las tres pruebas cubren `/health`, `/hello` y 404. |</w:t>
+      </w:r>
+    </w:p>
+    <w:p>
+      <w:pPr>
+        <w:rPr>
+          <w:rFonts w:cs="Times New Roman"/>
+        </w:rPr>
+      </w:pPr>
+      <w:r>
+        <w:rPr>
+          <w:rFonts w:cs="Times New Roman"/>
+        </w:rPr>
+        <w:t>| Artefacto | Dockerfile Python 3.11 y Docker Hub | Jenkins etiqueta la imagen con `BUILD_NUMBER-commit` y `latest`. |</w:t>
+      </w:r>
+    </w:p>
+    <w:p>
+      <w:pPr>
+        <w:rPr>
+          <w:rFonts w:cs="Times New Roman"/>
+        </w:rPr>
+      </w:pPr>
+      <w:r>
+        <w:rPr>
+          <w:rFonts w:cs="Times New Roman"/>
+        </w:rPr>
+        <w:t>| Seguridad | SonarCloud y Snyk | Jobs `sonarcloud` y `snyk`; configuracion en `sonar-project.properties` e informe en `docs/INFORME_SEGURIDAD.md`. |</w:t>
+      </w:r>
+    </w:p>
+    <w:p>
+      <w:pPr>
+        <w:rPr>
+          <w:rFonts w:cs="Times New Roman"/>
+        </w:rPr>
+      </w:pPr>
+      <w:r>
+        <w:rPr>
+          <w:rFonts w:cs="Times New Roman"/>
+        </w:rPr>
+        <w:t>| GitOps | Helm y Argo CD | `argocd/application.yaml` apunta al chart `helm` y usa `values-dev.yaml`. |</w:t>
+      </w:r>
+    </w:p>
+    <w:p>
+      <w:pPr>
+        <w:rPr>
+          <w:rFonts w:cs="Times New Roman"/>
+        </w:rPr>
+      </w:pPr>
+      <w:r>
+        <w:rPr>
+          <w:rFonts w:cs="Times New Roman"/>
+        </w:rPr>
         <w:lastRenderedPageBreak/>
-        <w:t>Evidencias tecnicas</w:t>
-      </w:r>
-    </w:p>
-    <w:p>
-      <w:pPr>
-        <w:rPr>
-          <w:rFonts w:ascii="Aptos" w:hAnsi="Aptos"/>
-          <w:sz w:val="22"/>
-        </w:rPr>
-      </w:pPr>
-    </w:p>
-    <w:p>
-      <w:pPr>
-        <w:rPr>
-          <w:rFonts w:ascii="Aptos" w:hAnsi="Aptos"/>
-          <w:sz w:val="22"/>
-        </w:rPr>
-      </w:pPr>
-      <w:r>
-        <w:rPr>
-          <w:rFonts w:ascii="Aptos" w:hAnsi="Aptos"/>
-          <w:sz w:val="22"/>
-        </w:rPr>
-        <w:t>| Requisito | Implementacion | Evidencia verificable |</w:t>
-      </w:r>
-    </w:p>
-    <w:p>
-      <w:pPr>
-        <w:rPr>
-          <w:rFonts w:ascii="Aptos" w:hAnsi="Aptos"/>
-          <w:sz w:val="22"/>
-        </w:rPr>
-      </w:pPr>
-      <w:r>
-        <w:rPr>
-          <w:rFonts w:ascii="Aptos" w:hAnsi="Aptos"/>
-          <w:sz w:val="22"/>
-        </w:rPr>
-        <w:t>| --- | --- | --- |</w:t>
-      </w:r>
-    </w:p>
-    <w:p>
-      <w:pPr>
-        <w:rPr>
-          <w:rFonts w:ascii="Aptos" w:hAnsi="Aptos"/>
-          <w:sz w:val="22"/>
-        </w:rPr>
-      </w:pPr>
-      <w:r>
-        <w:rPr>
-          <w:rFonts w:ascii="Aptos" w:hAnsi="Aptos"/>
-          <w:sz w:val="22"/>
-        </w:rPr>
-        <w:t>| CI/CD automatizado | `.github/workflows/ci.yml` y `Jenkinsfile` | Jobs independientes de GitHub Actions y ocho stages en Jenkins. |</w:t>
-      </w:r>
-    </w:p>
-    <w:p>
-      <w:pPr>
-        <w:rPr>
-          <w:rFonts w:ascii="Aptos" w:hAnsi="Aptos"/>
-          <w:sz w:val="22"/>
-        </w:rPr>
-      </w:pPr>
-      <w:r>
-        <w:rPr>
-          <w:rFonts w:ascii="Aptos" w:hAnsi="Aptos"/>
-          <w:sz w:val="22"/>
-        </w:rPr>
-        <w:t>| Calidad | `flake8` y `pytest` | El pipeline ejecuta `flake8 app tests` y `pytest tests -v`; las tres pruebas cubren `/health`, `/hello` y 404. |</w:t>
-      </w:r>
-    </w:p>
-    <w:p>
-      <w:pPr>
-        <w:rPr>
-          <w:rFonts w:ascii="Aptos" w:hAnsi="Aptos"/>
-          <w:sz w:val="22"/>
-        </w:rPr>
-      </w:pPr>
-      <w:r>
-        <w:rPr>
-          <w:rFonts w:ascii="Aptos" w:hAnsi="Aptos"/>
-          <w:sz w:val="22"/>
-        </w:rPr>
-        <w:t>| Artefacto | Dockerfile Python 3.11 y Docker Hub | Jenkins etiqueta la imagen con `BUILD_NUMBER-commit` y `latest`. |</w:t>
-      </w:r>
-    </w:p>
-    <w:p>
-      <w:pPr>
-        <w:rPr>
-          <w:rFonts w:ascii="Aptos" w:hAnsi="Aptos"/>
-          <w:sz w:val="22"/>
-        </w:rPr>
-      </w:pPr>
-      <w:r>
-        <w:rPr>
-          <w:rFonts w:ascii="Aptos" w:hAnsi="Aptos"/>
-          <w:sz w:val="22"/>
-        </w:rPr>
-        <w:t>| Seguridad | SonarCloud y Snyk | Jobs `sonarcloud` y `snyk`; configuracion en `sonar-project.properties` e informe en `docs/INFORME_SEGURIDAD.md`. |</w:t>
-      </w:r>
-    </w:p>
-    <w:p>
-      <w:pPr>
-        <w:rPr>
-          <w:rFonts w:ascii="Aptos" w:hAnsi="Aptos"/>
-          <w:sz w:val="22"/>
-        </w:rPr>
-      </w:pPr>
-      <w:r>
-        <w:rPr>
-          <w:rFonts w:ascii="Aptos" w:hAnsi="Aptos"/>
-          <w:sz w:val="22"/>
-        </w:rPr>
-        <w:t>| GitOps | Helm y Argo CD | `argocd/application.yaml` apunta al chart `helm` y usa `values-dev.yaml`. |</w:t>
-      </w:r>
-    </w:p>
-    <w:p>
-      <w:pPr>
-        <w:rPr>
-          <w:rFonts w:ascii="Aptos" w:hAnsi="Aptos"/>
-          <w:sz w:val="22"/>
-        </w:rPr>
-      </w:pPr>
-      <w:r>
-        <w:rPr>
-          <w:rFonts w:ascii="Aptos" w:hAnsi="Aptos"/>
-          <w:sz w:val="22"/>
-        </w:rPr>
         <w:t>| Monitoreo | Prometheus y Grafana | `docker-compose.monitoring.yml` arranca ambos servicios y provisiona el dashboard. |</w:t>
       </w:r>
     </w:p>
     <w:p>
       <w:pPr>
         <w:rPr>
-          <w:rFonts w:ascii="Aptos" w:hAnsi="Aptos"/>
-          <w:sz w:val="22"/>
-        </w:rPr>
-      </w:pPr>
-    </w:p>
-    <w:p>
-      <w:pPr>
-        <w:rPr>
-          <w:rFonts w:ascii="Aptos" w:hAnsi="Aptos"/>
-          <w:sz w:val="22"/>
-        </w:rPr>
-      </w:pPr>
-      <w:r>
-        <w:rPr>
-          <w:rFonts w:ascii="Aptos" w:hAnsi="Aptos"/>
-          <w:sz w:val="22"/>
+          <w:rFonts w:cs="Times New Roman"/>
+        </w:rPr>
+      </w:pPr>
+    </w:p>
+    <w:p>
+      <w:pPr>
+        <w:rPr>
+          <w:rFonts w:cs="Times New Roman"/>
+        </w:rPr>
+      </w:pPr>
+      <w:r>
+        <w:rPr>
+          <w:rFonts w:cs="Times New Roman"/>
         </w:rPr>
         <w:t>La ejecucion Jenkins #7 documentada durante la practica termino en `SUCCESS`: la captura autenticada de Pipeline Overview muestra aprobados los stages de checkout, dependencias, analisis estatico, pruebas unitarias, build Docker, validacion Helm, publicacion de imagen y actualizacion GitOps. Adicionalmente, la ejecucion GitHub Actions `33335315017` del 30 de agosto de 2026 finalizo exitosamente con los jobs `lint`, `test`, `docker-build-validation`, `snyk` y `sonarcloud`, y publico el artefacto descargable `snyk-report`. La evidencia operativa y las capturas propias estan consolidadas en `docs/EVIDENCIA_OPERATIVA.md`.</w:t>
       </w:r>
@@ -415,117 +403,137 @@
     <w:p>
       <w:pPr>
         <w:rPr>
-          <w:rFonts w:ascii="Aptos" w:hAnsi="Aptos"/>
-          <w:sz w:val="22"/>
+          <w:rFonts w:cs="Times New Roman"/>
         </w:rPr>
       </w:pPr>
     </w:p>
     <w:p>
       <w:pPr>
         <w:pStyle w:val="Ttulo1"/>
-      </w:pPr>
-      <w:r>
+        <w:jc w:val="center"/>
+        <w:rPr>
+          <w:rFonts w:ascii="Times New Roman" w:hAnsi="Times New Roman" w:cs="Times New Roman"/>
+          <w:b/>
+          <w:sz w:val="24"/>
+        </w:rPr>
+      </w:pPr>
+      <w:r>
+        <w:rPr>
+          <w:rFonts w:ascii="Times New Roman" w:hAnsi="Times New Roman" w:cs="Times New Roman"/>
+          <w:b/>
+          <w:sz w:val="24"/>
+        </w:rPr>
         <w:t>Seguridad y recomendaciones</w:t>
       </w:r>
     </w:p>
     <w:p>
       <w:pPr>
         <w:rPr>
-          <w:rFonts w:ascii="Aptos" w:hAnsi="Aptos"/>
-          <w:sz w:val="22"/>
-        </w:rPr>
-      </w:pPr>
-    </w:p>
-    <w:p>
-      <w:pPr>
-        <w:rPr>
-          <w:rFonts w:ascii="Aptos" w:hAnsi="Aptos"/>
-          <w:sz w:val="22"/>
-        </w:rPr>
-      </w:pPr>
-      <w:r>
-        <w:rPr>
-          <w:rFonts w:ascii="Aptos" w:hAnsi="Aptos"/>
-          <w:sz w:val="22"/>
-        </w:rPr>
-        <w:t>SonarCloud analiza las fuentes Python y Snyk analiza las dependencias declaradas. Los secretos `SONAR_TOKEN` y `SNYK_TOKEN` se gestionan desde GitHub Actions, mientras que Jenkins usa credenciales de Docker Hub y GitHub administradas por el servidor. Las recomendaciones son: revisar el Quality Gate antes de promover una version, resolver vulnerabilidades de severidad alta, utilizar tokens de alcance minimo y rotar toda contrasena que haya sido compartida fuera de un gestor de secretos.</w:t>
-      </w:r>
-    </w:p>
-    <w:p>
-      <w:pPr>
-        <w:rPr>
-          <w:rFonts w:ascii="Aptos" w:hAnsi="Aptos"/>
-          <w:sz w:val="22"/>
+          <w:rFonts w:cs="Times New Roman"/>
+        </w:rPr>
+      </w:pPr>
+    </w:p>
+    <w:p>
+      <w:pPr>
+        <w:rPr>
+          <w:rFonts w:cs="Times New Roman"/>
+        </w:rPr>
+      </w:pPr>
+      <w:r>
+        <w:rPr>
+          <w:rFonts w:cs="Times New Roman"/>
+        </w:rPr>
+        <w:t>SonarCloud analiza las fuentes Python y Snyk analiza las dependencias declaradas. Los secretos `SONAR_TOKEN` y `SNYK_TOKEN` se gestionan desde GitHub Actions, mientras que Jenkins usa credenciales de Docker Hub y GitHub administradas por el servidor. Esta combinacion integra analisis de calidad y escaneo de dependencias durante CI (GitHub, 2026; Snyk, n.d.). Las recomendaciones son: revisar el Quality Gate antes de promover una version, resolver vulnerabilidades de severidad alta, utilizar tokens de alcance minimo y rotar toda contrasena que haya sido compartida fuera de un gestor de secretos.</w:t>
+      </w:r>
+    </w:p>
+    <w:p>
+      <w:pPr>
+        <w:rPr>
+          <w:rFonts w:cs="Times New Roman"/>
         </w:rPr>
       </w:pPr>
     </w:p>
     <w:p>
       <w:pPr>
         <w:pStyle w:val="Ttulo1"/>
-      </w:pPr>
-      <w:r>
-        <w:lastRenderedPageBreak/>
+        <w:jc w:val="center"/>
+        <w:rPr>
+          <w:rFonts w:ascii="Times New Roman" w:hAnsi="Times New Roman" w:cs="Times New Roman"/>
+          <w:b/>
+          <w:sz w:val="24"/>
+        </w:rPr>
+      </w:pPr>
+      <w:r>
+        <w:rPr>
+          <w:rFonts w:ascii="Times New Roman" w:hAnsi="Times New Roman" w:cs="Times New Roman"/>
+          <w:b/>
+          <w:sz w:val="24"/>
+        </w:rPr>
         <w:t>Monitoreo y alertas</w:t>
       </w:r>
     </w:p>
     <w:p>
       <w:pPr>
         <w:rPr>
-          <w:rFonts w:ascii="Aptos" w:hAnsi="Aptos"/>
-          <w:sz w:val="22"/>
-        </w:rPr>
-      </w:pPr>
-    </w:p>
-    <w:p>
-      <w:pPr>
-        <w:rPr>
-          <w:rFonts w:ascii="Aptos" w:hAnsi="Aptos"/>
-          <w:sz w:val="22"/>
-        </w:rPr>
-      </w:pPr>
-      <w:r>
-        <w:rPr>
-          <w:rFonts w:ascii="Aptos" w:hAnsi="Aptos"/>
-          <w:sz w:val="22"/>
-        </w:rPr>
-        <w:t>`prometheus-fastapi-instrumentator` expone `/metrics`. Prometheus recolecta cada 15 segundos y Grafana carga automaticamente el dashboard **Mi Microservicio - Operacion**. Este muestra estado del objetivo (`up`), memoria residente, uso de CPU y solicitudes HTTP por handler, metodo y codigo de respuesta. Se definieron dos alertas: indisponibilidad de la aplicacion durante un minuto y memoria residente superior a 100 MiB durante cinco minutos.</w:t>
-      </w:r>
-    </w:p>
-    <w:p>
-      <w:pPr>
-        <w:rPr>
-          <w:rFonts w:ascii="Aptos" w:hAnsi="Aptos"/>
-          <w:sz w:val="22"/>
+          <w:rFonts w:cs="Times New Roman"/>
+        </w:rPr>
+      </w:pPr>
+    </w:p>
+    <w:p>
+      <w:pPr>
+        <w:rPr>
+          <w:rFonts w:cs="Times New Roman"/>
+        </w:rPr>
+      </w:pPr>
+      <w:r>
+        <w:rPr>
+          <w:rFonts w:cs="Times New Roman"/>
+        </w:rPr>
+        <w:t>`prometheus-fastapi-instrumentator` expone `/metrics`. Prometheus recolecta cada 15 segundos y Grafana carga automaticamente el dashboard **Mi Microservicio - Operacion**. Este muestra estado del objetivo (`up`), memoria residente, uso de CPU y solicitudes HTTP por handler, metodo y codigo de respuesta. Prometheus se utiliza para recolectar series temporales y Grafana para visualizarlas operacionalmente (Prometheus, n.d.; Grafana Labs, n.d.). Se definieron dos alertas: indisponibilidad de la aplicacion durante un minuto y memoria residente superior a 100 MiB durante cinco minutos.</w:t>
+      </w:r>
+    </w:p>
+    <w:p>
+      <w:pPr>
+        <w:rPr>
+          <w:rFonts w:cs="Times New Roman"/>
         </w:rPr>
       </w:pPr>
     </w:p>
     <w:p>
       <w:pPr>
         <w:pStyle w:val="Ttulo1"/>
-      </w:pPr>
-      <w:r>
+        <w:jc w:val="center"/>
+        <w:rPr>
+          <w:rFonts w:ascii="Times New Roman" w:hAnsi="Times New Roman" w:cs="Times New Roman"/>
+          <w:b/>
+          <w:sz w:val="24"/>
+        </w:rPr>
+      </w:pPr>
+      <w:r>
+        <w:rPr>
+          <w:rFonts w:ascii="Times New Roman" w:hAnsi="Times New Roman" w:cs="Times New Roman"/>
+          <w:b/>
+          <w:sz w:val="24"/>
+        </w:rPr>
         <w:t>Ejecucion de la evidencia</w:t>
       </w:r>
     </w:p>
     <w:p>
       <w:pPr>
         <w:rPr>
-          <w:rFonts w:ascii="Aptos" w:hAnsi="Aptos"/>
-          <w:sz w:val="22"/>
-        </w:rPr>
-      </w:pPr>
-    </w:p>
-    <w:p>
-      <w:pPr>
-        <w:rPr>
-          <w:rFonts w:ascii="Aptos" w:hAnsi="Aptos"/>
-          <w:sz w:val="22"/>
-        </w:rPr>
-      </w:pPr>
-      <w:r>
-        <w:rPr>
-          <w:rFonts w:ascii="Aptos" w:hAnsi="Aptos"/>
-          <w:sz w:val="22"/>
+          <w:rFonts w:cs="Times New Roman"/>
+        </w:rPr>
+      </w:pPr>
+    </w:p>
+    <w:p>
+      <w:pPr>
+        <w:rPr>
+          <w:rFonts w:cs="Times New Roman"/>
+        </w:rPr>
+      </w:pPr>
+      <w:r>
+        <w:rPr>
+          <w:rFonts w:cs="Times New Roman"/>
         </w:rPr>
         <w:t>```bash</w:t>
       </w:r>
@@ -533,14 +541,12 @@
     <w:p>
       <w:pPr>
         <w:rPr>
-          <w:rFonts w:ascii="Aptos" w:hAnsi="Aptos"/>
-          <w:sz w:val="22"/>
-        </w:rPr>
-      </w:pPr>
-      <w:r>
-        <w:rPr>
-          <w:rFonts w:ascii="Aptos" w:hAnsi="Aptos"/>
-          <w:sz w:val="22"/>
+          <w:rFonts w:cs="Times New Roman"/>
+        </w:rPr>
+      </w:pPr>
+      <w:r>
+        <w:rPr>
+          <w:rFonts w:cs="Times New Roman"/>
         </w:rPr>
         <w:t>docker compose -f docker-compose.monitoring.yml up --build -d</w:t>
       </w:r>
@@ -548,6 +554,56 @@
     <w:p>
       <w:pPr>
         <w:rPr>
+          <w:rFonts w:ascii="Consolas" w:hAnsi="Consolas" w:cs="Times New Roman"/>
+          <w:sz w:val="18"/>
+        </w:rPr>
+      </w:pPr>
+    </w:p>
+    <w:p>
+      <w:pPr>
+        <w:rPr>
+          <w:rFonts w:ascii="Consolas" w:hAnsi="Consolas" w:cs="Times New Roman"/>
+          <w:sz w:val="18"/>
+        </w:rPr>
+      </w:pPr>
+      <w:r>
+        <w:rPr>
+          <w:rFonts w:ascii="Consolas" w:hAnsi="Consolas" w:cs="Times New Roman"/>
+          <w:sz w:val="18"/>
+        </w:rPr>
+        <w:t>Abrir Grafana en `http://localhost:3000` y Prometheus en `http://localhost:9090`. Producir trafico con solicitudes a `http://localhost:8001/health` y `http://localhost:8001/hello`, y capturar el dashboard. La definicion de alertas se puede verificar en Prometheus, menu **Alerts**.</w:t>
+      </w:r>
+    </w:p>
+    <w:p>
+      <w:pPr>
+        <w:rPr>
+          <w:rFonts w:ascii="Consolas" w:hAnsi="Consolas" w:cs="Times New Roman"/>
+          <w:sz w:val="18"/>
+        </w:rPr>
+      </w:pPr>
+    </w:p>
+    <w:p>
+      <w:pPr>
+        <w:pStyle w:val="Ttulo1"/>
+        <w:jc w:val="center"/>
+        <w:rPr>
+          <w:rFonts w:ascii="Times New Roman" w:hAnsi="Times New Roman" w:cs="Times New Roman"/>
+          <w:b/>
+          <w:sz w:val="24"/>
+        </w:rPr>
+      </w:pPr>
+      <w:r>
+        <w:rPr>
+          <w:rFonts w:ascii="Times New Roman" w:hAnsi="Times New Roman" w:cs="Times New Roman"/>
+          <w:b/>
+          <w:sz w:val="24"/>
+        </w:rPr>
+        <w:t>Reflexion</w:t>
+      </w:r>
+    </w:p>
+    <w:p>
+      <w:pPr>
+        <w:rPr>
           <w:rFonts w:ascii="Consolas" w:hAnsi="Consolas"/>
           <w:sz w:val="18"/>
         </w:rPr>
@@ -565,23 +621,48 @@
           <w:rFonts w:ascii="Consolas" w:hAnsi="Consolas"/>
           <w:sz w:val="18"/>
         </w:rPr>
-        <w:t>Abrir Grafana en `http://localhost:3000` y Prometheus en `http://localhost:9090`. Producir trafico con solicitudes a `http://localhost:8001/health` y `http://localhost:8001/hello`, y capturar el dashboard. La definicion de alertas se puede verificar en Prometheus, menu **Alerts**.</w:t>
-      </w:r>
-    </w:p>
-    <w:p>
-      <w:pPr>
+        <w:t>Separar CI, CD, GitOps y observabilidad disminuye el riesgo operacional. GitHub Actions detecta defectos cerca del cambio; Jenkins construye un artefacto trazable; Helm convierte configuracion en manifiestos repetibles; Argo CD evita credenciales de Kubernetes dentro del pipeline; y Prometheus/Grafana convierten el comportamiento en produccion en una se</w:t>
+      </w:r>
+      <w:r>
+        <w:rPr>
+          <w:rFonts w:ascii="Consolas" w:hAnsi="Consolas" w:hint="eastAsia"/>
+          <w:sz w:val="18"/>
+        </w:rPr>
+        <w:t>ñ</w:t>
+      </w:r>
+      <w:r>
         <w:rPr>
           <w:rFonts w:ascii="Consolas" w:hAnsi="Consolas"/>
           <w:sz w:val="18"/>
         </w:rPr>
+        <w:t>al observable. El principal aprendizaje es que automatizar el despliegue no es suficiente: un flujo maduro requiere controles de seguridad, trazabilidad de imagen y monitoreo posterior a la liberacion, una relacion coherente con la disciplina SRE (Google, n.d.).</w:t>
+      </w:r>
+    </w:p>
+    <w:p>
+      <w:pPr>
+        <w:rPr>
+          <w:rFonts w:ascii="Consolas" w:hAnsi="Consolas"/>
+          <w:sz w:val="18"/>
+        </w:rPr>
       </w:pPr>
     </w:p>
     <w:p>
       <w:pPr>
         <w:pStyle w:val="Ttulo1"/>
-      </w:pPr>
-      <w:r>
-        <w:t>Reflexion</w:t>
+        <w:jc w:val="center"/>
+        <w:rPr>
+          <w:rFonts w:ascii="Times New Roman" w:hAnsi="Times New Roman" w:cs="Times New Roman"/>
+          <w:b/>
+          <w:sz w:val="24"/>
+        </w:rPr>
+      </w:pPr>
+      <w:r>
+        <w:rPr>
+          <w:rFonts w:ascii="Times New Roman" w:hAnsi="Times New Roman" w:cs="Times New Roman"/>
+          <w:b/>
+          <w:sz w:val="24"/>
+        </w:rPr>
+        <w:t>Referencias</w:t>
       </w:r>
     </w:p>
     <w:p>
@@ -604,21 +685,122 @@
           <w:rFonts w:ascii="Consolas" w:hAnsi="Consolas"/>
           <w:sz w:val="18"/>
         </w:rPr>
-        <w:t>Separar CI, CD, GitOps y observabilidad disminuye el riesgo operacional. GitHub Actions detecta defectos cerca del cambio; Jenkins construye un artefacto trazable; Helm convierte configuracion en manifiestos repetibles; Argo CD evita credenciales de Kubernetes dentro del pipeline; y Prometheus/Grafana convierten el comportamiento en produccion en una se</w:t>
-      </w:r>
-      <w:r>
-        <w:rPr>
-          <w:rFonts w:ascii="Consolas" w:hAnsi="Consolas" w:hint="eastAsia"/>
-          <w:sz w:val="18"/>
-        </w:rPr>
-        <w:t>ñ</w:t>
-      </w:r>
-      <w:r>
+        <w:t>GitHub. (2026). *GitHub Actions documentation*. https://docs.github.com/actions</w:t>
+      </w:r>
+    </w:p>
+    <w:p>
+      <w:pPr>
         <w:rPr>
           <w:rFonts w:ascii="Consolas" w:hAnsi="Consolas"/>
           <w:sz w:val="18"/>
         </w:rPr>
-        <w:t>al observable. El principal aprendizaje es que automatizar el despliegue no es suficiente: un flujo maduro requiere controles de seguridad, trazabilidad de imagen y monitoreo posterior a la liberacion.</w:t>
+      </w:pPr>
+    </w:p>
+    <w:p>
+      <w:pPr>
+        <w:rPr>
+          <w:rFonts w:ascii="Consolas" w:hAnsi="Consolas"/>
+          <w:sz w:val="18"/>
+        </w:rPr>
+      </w:pPr>
+      <w:r>
+        <w:rPr>
+          <w:rFonts w:ascii="Consolas" w:hAnsi="Consolas"/>
+          <w:sz w:val="18"/>
+        </w:rPr>
+        <w:t>Grafana Labs. (n.d.). *Grafana documentation*. https://grafana.com/docs/grafana/</w:t>
+      </w:r>
+    </w:p>
+    <w:p>
+      <w:pPr>
+        <w:rPr>
+          <w:rFonts w:ascii="Consolas" w:hAnsi="Consolas"/>
+          <w:sz w:val="18"/>
+        </w:rPr>
+      </w:pPr>
+    </w:p>
+    <w:p>
+      <w:pPr>
+        <w:rPr>
+          <w:rFonts w:ascii="Consolas" w:hAnsi="Consolas"/>
+          <w:sz w:val="18"/>
+        </w:rPr>
+      </w:pPr>
+      <w:r>
+        <w:rPr>
+          <w:rFonts w:ascii="Consolas" w:hAnsi="Consolas"/>
+          <w:sz w:val="18"/>
+        </w:rPr>
+        <w:t>Google. (n.d.). *How SRE relates to other disciplines*. https://sre.google/workbook/how-sre-relates/</w:t>
+      </w:r>
+    </w:p>
+    <w:p>
+      <w:pPr>
+        <w:rPr>
+          <w:rFonts w:ascii="Consolas" w:hAnsi="Consolas"/>
+          <w:sz w:val="18"/>
+        </w:rPr>
+      </w:pPr>
+    </w:p>
+    <w:p>
+      <w:pPr>
+        <w:rPr>
+          <w:rFonts w:ascii="Consolas" w:hAnsi="Consolas"/>
+          <w:sz w:val="18"/>
+        </w:rPr>
+      </w:pPr>
+      <w:r>
+        <w:rPr>
+          <w:rFonts w:ascii="Consolas" w:hAnsi="Consolas"/>
+          <w:sz w:val="18"/>
+        </w:rPr>
+        <w:t>Humble, J., &amp; Farley, D. (2010). *Continuous delivery: Reliable software releases through build, test, and deployment automation*. Addison-Wesley Professional.</w:t>
+      </w:r>
+    </w:p>
+    <w:p>
+      <w:pPr>
+        <w:rPr>
+          <w:rFonts w:ascii="Consolas" w:hAnsi="Consolas"/>
+          <w:sz w:val="18"/>
+        </w:rPr>
+      </w:pPr>
+    </w:p>
+    <w:p>
+      <w:pPr>
+        <w:rPr>
+          <w:rFonts w:ascii="Consolas" w:hAnsi="Consolas"/>
+          <w:sz w:val="18"/>
+        </w:rPr>
+      </w:pPr>
+      <w:r>
+        <w:rPr>
+          <w:rFonts w:ascii="Consolas" w:hAnsi="Consolas"/>
+          <w:sz w:val="18"/>
+        </w:rPr>
+        <w:t>Prometheus. (n.d.). *Prometheus documentation*. https://prometheus.io/docs/</w:t>
+      </w:r>
+    </w:p>
+    <w:p>
+      <w:pPr>
+        <w:rPr>
+          <w:rFonts w:ascii="Consolas" w:hAnsi="Consolas"/>
+          <w:sz w:val="18"/>
+        </w:rPr>
+      </w:pPr>
+    </w:p>
+    <w:p>
+      <w:pPr>
+        <w:rPr>
+          <w:rFonts w:ascii="Consolas" w:hAnsi="Consolas"/>
+          <w:sz w:val="18"/>
+        </w:rPr>
+      </w:pPr>
+      <w:r>
+        <w:rPr>
+          <w:rFonts w:ascii="Consolas" w:hAnsi="Consolas"/>
+          <w:sz w:val="18"/>
+        </w:rPr>
+        <w:t>Snyk. (n.d.). *Snyk Open Source documentation*. https://docs.snyk.io/scan-with-snyk/snyk-open-source</w:t>
       </w:r>
     </w:p>
     <w:p>
@@ -626,7 +808,6 @@
         <w:pStyle w:val="Ttulo1"/>
       </w:pPr>
       <w:r>
-        <w:lastRenderedPageBreak/>
         <w:t>Evidencia visual: dashboard Grafana activo</w:t>
       </w:r>
     </w:p>
@@ -636,16 +817,16 @@
           <w:noProof/>
         </w:rPr>
         <w:drawing>
-          <wp:inline distT="0" distB="0" distL="0" distR="0" wp14:anchorId="19B91B94" wp14:editId="0FB45676">
+          <wp:inline distT="0" distB="0" distL="0" distR="0" wp14:anchorId="0D62AF91" wp14:editId="55844125">
             <wp:extent cx="5842000" cy="3302000"/>
             <wp:effectExtent l="0" t="0" r="6350" b="0"/>
-            <wp:docPr id="83047676" name="Imagen 1"/>
+            <wp:docPr id="358662574" name="Imagen 1"/>
             <wp:cNvGraphicFramePr/>
             <a:graphic xmlns:a="http://schemas.openxmlformats.org/drawingml/2006/main">
               <a:graphicData uri="http://schemas.openxmlformats.org/drawingml/2006/picture">
                 <pic:pic xmlns:pic="http://schemas.openxmlformats.org/drawingml/2006/picture">
                   <pic:nvPicPr>
-                    <pic:cNvPr id="83047676" name=""/>
+                    <pic:cNvPr id="358662574" name=""/>
                     <pic:cNvPicPr/>
                   </pic:nvPicPr>
                   <pic:blipFill>
@@ -676,9 +857,338 @@
         </w:drawing>
       </w:r>
     </w:p>
+    <w:p>
+      <w:pPr>
+        <w:spacing w:after="160" w:line="278" w:lineRule="auto"/>
+      </w:pPr>
+      <w:r>
+        <w:br w:type="page"/>
+      </w:r>
+    </w:p>
+    <w:p>
+      <w:pPr>
+        <w:rPr>
+          <w:b/>
+          <w:sz w:val="28"/>
+        </w:rPr>
+      </w:pPr>
+      <w:r>
+        <w:rPr>
+          <w:b/>
+          <w:sz w:val="28"/>
+        </w:rPr>
+        <w:t>Anexo A. Evidencias fotograficas de la ejecucion</w:t>
+      </w:r>
+    </w:p>
+    <w:p>
+      <w:pPr>
+        <w:rPr>
+          <w:i/>
+          <w:sz w:val="20"/>
+        </w:rPr>
+      </w:pPr>
+      <w:r>
+        <w:rPr>
+          <w:i/>
+          <w:sz w:val="20"/>
+        </w:rPr>
+        <w:t>Figura 1. Ejecucion exitosa de GitHub Actions con Snyk y SonarCloud.</w:t>
+      </w:r>
+    </w:p>
+    <w:p>
+      <w:r>
+        <w:rPr>
+          <w:noProof/>
+        </w:rPr>
+        <w:drawing>
+          <wp:inline distT="0" distB="0" distL="0" distR="0" wp14:anchorId="1AFB2F8B" wp14:editId="75263320">
+            <wp:extent cx="5842000" cy="4064000"/>
+            <wp:effectExtent l="0" t="0" r="6350" b="0"/>
+            <wp:docPr id="2078312084" name="Imagen 1"/>
+            <wp:cNvGraphicFramePr/>
+            <a:graphic xmlns:a="http://schemas.openxmlformats.org/drawingml/2006/main">
+              <a:graphicData uri="http://schemas.openxmlformats.org/drawingml/2006/picture">
+                <pic:pic xmlns:pic="http://schemas.openxmlformats.org/drawingml/2006/picture">
+                  <pic:nvPicPr>
+                    <pic:cNvPr id="2078312084" name=""/>
+                    <pic:cNvPicPr/>
+                  </pic:nvPicPr>
+                  <pic:blipFill>
+                    <a:blip r:embed="rId6" cstate="print">
+                      <a:extLst>
+                        <a:ext uri="{28A0092B-C50C-407E-A947-70E740481C1C}">
+                          <a14:useLocalDpi xmlns:a14="http://schemas.microsoft.com/office/drawing/2010/main" val="0"/>
+                        </a:ext>
+                      </a:extLst>
+                    </a:blip>
+                    <a:stretch>
+                      <a:fillRect/>
+                    </a:stretch>
+                  </pic:blipFill>
+                  <pic:spPr>
+                    <a:xfrm>
+                      <a:off x="0" y="0"/>
+                      <a:ext cx="5842000" cy="4064000"/>
+                    </a:xfrm>
+                    <a:prstGeom prst="rect">
+                      <a:avLst/>
+                    </a:prstGeom>
+                  </pic:spPr>
+                </pic:pic>
+              </a:graphicData>
+            </a:graphic>
+          </wp:inline>
+        </w:drawing>
+      </w:r>
+    </w:p>
+    <w:p>
+      <w:pPr>
+        <w:rPr>
+          <w:i/>
+          <w:sz w:val="20"/>
+        </w:rPr>
+      </w:pPr>
+      <w:r>
+        <w:rPr>
+          <w:i/>
+          <w:sz w:val="20"/>
+        </w:rPr>
+        <w:t>Figura 2. Quality Gate aprobado en SonarQube Cloud.</w:t>
+      </w:r>
+    </w:p>
+    <w:p>
+      <w:r>
+        <w:rPr>
+          <w:noProof/>
+        </w:rPr>
+        <w:drawing>
+          <wp:inline distT="0" distB="0" distL="0" distR="0" wp14:anchorId="2090D0E9" wp14:editId="2292CF44">
+            <wp:extent cx="5842000" cy="3788410"/>
+            <wp:effectExtent l="0" t="0" r="6350" b="2540"/>
+            <wp:docPr id="117694024" name="Imagen 2"/>
+            <wp:cNvGraphicFramePr/>
+            <a:graphic xmlns:a="http://schemas.openxmlformats.org/drawingml/2006/main">
+              <a:graphicData uri="http://schemas.openxmlformats.org/drawingml/2006/picture">
+                <pic:pic xmlns:pic="http://schemas.openxmlformats.org/drawingml/2006/picture">
+                  <pic:nvPicPr>
+                    <pic:cNvPr id="117694024" name=""/>
+                    <pic:cNvPicPr/>
+                  </pic:nvPicPr>
+                  <pic:blipFill>
+                    <a:blip r:embed="rId7" cstate="print">
+                      <a:extLst>
+                        <a:ext uri="{28A0092B-C50C-407E-A947-70E740481C1C}">
+                          <a14:useLocalDpi xmlns:a14="http://schemas.microsoft.com/office/drawing/2010/main" val="0"/>
+                        </a:ext>
+                      </a:extLst>
+                    </a:blip>
+                    <a:stretch>
+                      <a:fillRect/>
+                    </a:stretch>
+                  </pic:blipFill>
+                  <pic:spPr>
+                    <a:xfrm>
+                      <a:off x="0" y="0"/>
+                      <a:ext cx="5842000" cy="3788410"/>
+                    </a:xfrm>
+                    <a:prstGeom prst="rect">
+                      <a:avLst/>
+                    </a:prstGeom>
+                  </pic:spPr>
+                </pic:pic>
+              </a:graphicData>
+            </a:graphic>
+          </wp:inline>
+        </w:drawing>
+      </w:r>
+    </w:p>
+    <w:p>
+      <w:pPr>
+        <w:rPr>
+          <w:i/>
+          <w:sz w:val="20"/>
+        </w:rPr>
+      </w:pPr>
+      <w:r>
+        <w:rPr>
+          <w:i/>
+          <w:sz w:val="20"/>
+        </w:rPr>
+        <w:t>Figura 3. Target del microservicio en estado UP en Prometheus.</w:t>
+      </w:r>
+    </w:p>
+    <w:p>
+      <w:r>
+        <w:rPr>
+          <w:noProof/>
+        </w:rPr>
+        <w:drawing>
+          <wp:inline distT="0" distB="0" distL="0" distR="0" wp14:anchorId="6434E370" wp14:editId="44F5BE50">
+            <wp:extent cx="5842000" cy="3788410"/>
+            <wp:effectExtent l="0" t="0" r="6350" b="2540"/>
+            <wp:docPr id="562115853" name="Imagen 3"/>
+            <wp:cNvGraphicFramePr/>
+            <a:graphic xmlns:a="http://schemas.openxmlformats.org/drawingml/2006/main">
+              <a:graphicData uri="http://schemas.openxmlformats.org/drawingml/2006/picture">
+                <pic:pic xmlns:pic="http://schemas.openxmlformats.org/drawingml/2006/picture">
+                  <pic:nvPicPr>
+                    <pic:cNvPr id="562115853" name=""/>
+                    <pic:cNvPicPr/>
+                  </pic:nvPicPr>
+                  <pic:blipFill>
+                    <a:blip r:embed="rId8" cstate="print">
+                      <a:extLst>
+                        <a:ext uri="{28A0092B-C50C-407E-A947-70E740481C1C}">
+                          <a14:useLocalDpi xmlns:a14="http://schemas.microsoft.com/office/drawing/2010/main" val="0"/>
+                        </a:ext>
+                      </a:extLst>
+                    </a:blip>
+                    <a:stretch>
+                      <a:fillRect/>
+                    </a:stretch>
+                  </pic:blipFill>
+                  <pic:spPr>
+                    <a:xfrm>
+                      <a:off x="0" y="0"/>
+                      <a:ext cx="5842000" cy="3788410"/>
+                    </a:xfrm>
+                    <a:prstGeom prst="rect">
+                      <a:avLst/>
+                    </a:prstGeom>
+                  </pic:spPr>
+                </pic:pic>
+              </a:graphicData>
+            </a:graphic>
+          </wp:inline>
+        </w:drawing>
+      </w:r>
+    </w:p>
+    <w:p>
+      <w:pPr>
+        <w:rPr>
+          <w:i/>
+          <w:sz w:val="20"/>
+        </w:rPr>
+      </w:pPr>
+      <w:r>
+        <w:rPr>
+          <w:i/>
+          <w:sz w:val="20"/>
+        </w:rPr>
+        <w:t>Figura 4. Dashboard Grafana con metricas operativas.</w:t>
+      </w:r>
+    </w:p>
+    <w:p>
+      <w:r>
+        <w:rPr>
+          <w:noProof/>
+        </w:rPr>
+        <w:drawing>
+          <wp:inline distT="0" distB="0" distL="0" distR="0" wp14:anchorId="3652C9C3" wp14:editId="2B8268A8">
+            <wp:extent cx="5842000" cy="4064000"/>
+            <wp:effectExtent l="0" t="0" r="6350" b="0"/>
+            <wp:docPr id="965308562" name="Imagen 4"/>
+            <wp:cNvGraphicFramePr/>
+            <a:graphic xmlns:a="http://schemas.openxmlformats.org/drawingml/2006/main">
+              <a:graphicData uri="http://schemas.openxmlformats.org/drawingml/2006/picture">
+                <pic:pic xmlns:pic="http://schemas.openxmlformats.org/drawingml/2006/picture">
+                  <pic:nvPicPr>
+                    <pic:cNvPr id="965308562" name=""/>
+                    <pic:cNvPicPr/>
+                  </pic:nvPicPr>
+                  <pic:blipFill>
+                    <a:blip r:embed="rId5" cstate="print">
+                      <a:extLst>
+                        <a:ext uri="{28A0092B-C50C-407E-A947-70E740481C1C}">
+                          <a14:useLocalDpi xmlns:a14="http://schemas.microsoft.com/office/drawing/2010/main" val="0"/>
+                        </a:ext>
+                      </a:extLst>
+                    </a:blip>
+                    <a:stretch>
+                      <a:fillRect/>
+                    </a:stretch>
+                  </pic:blipFill>
+                  <pic:spPr>
+                    <a:xfrm>
+                      <a:off x="0" y="0"/>
+                      <a:ext cx="5842000" cy="4064000"/>
+                    </a:xfrm>
+                    <a:prstGeom prst="rect">
+                      <a:avLst/>
+                    </a:prstGeom>
+                  </pic:spPr>
+                </pic:pic>
+              </a:graphicData>
+            </a:graphic>
+          </wp:inline>
+        </w:drawing>
+      </w:r>
+    </w:p>
+    <w:p>
+      <w:pPr>
+        <w:rPr>
+          <w:i/>
+          <w:sz w:val="20"/>
+        </w:rPr>
+      </w:pPr>
+      <w:r>
+        <w:rPr>
+          <w:i/>
+          <w:sz w:val="20"/>
+        </w:rPr>
+        <w:t>Figura 5. Pipeline Overview autenticado de Jenkins, build #7 exitoso.</w:t>
+      </w:r>
+    </w:p>
+    <w:p>
+      <w:r>
+        <w:rPr>
+          <w:noProof/>
+        </w:rPr>
+        <w:drawing>
+          <wp:inline distT="0" distB="0" distL="0" distR="0" wp14:anchorId="34BCADC8" wp14:editId="2323B278">
+            <wp:extent cx="5842000" cy="3788410"/>
+            <wp:effectExtent l="0" t="0" r="6350" b="2540"/>
+            <wp:docPr id="182892795" name="Imagen 5"/>
+            <wp:cNvGraphicFramePr/>
+            <a:graphic xmlns:a="http://schemas.openxmlformats.org/drawingml/2006/main">
+              <a:graphicData uri="http://schemas.openxmlformats.org/drawingml/2006/picture">
+                <pic:pic xmlns:pic="http://schemas.openxmlformats.org/drawingml/2006/picture">
+                  <pic:nvPicPr>
+                    <pic:cNvPr id="182892795" name=""/>
+                    <pic:cNvPicPr/>
+                  </pic:nvPicPr>
+                  <pic:blipFill>
+                    <a:blip r:embed="rId9" cstate="print">
+                      <a:extLst>
+                        <a:ext uri="{28A0092B-C50C-407E-A947-70E740481C1C}">
+                          <a14:useLocalDpi xmlns:a14="http://schemas.microsoft.com/office/drawing/2010/main" val="0"/>
+                        </a:ext>
+                      </a:extLst>
+                    </a:blip>
+                    <a:stretch>
+                      <a:fillRect/>
+                    </a:stretch>
+                  </pic:blipFill>
+                  <pic:spPr>
+                    <a:xfrm>
+                      <a:off x="0" y="0"/>
+                      <a:ext cx="5842000" cy="3788410"/>
+                    </a:xfrm>
+                    <a:prstGeom prst="rect">
+                      <a:avLst/>
+                    </a:prstGeom>
+                  </pic:spPr>
+                </pic:pic>
+              </a:graphicData>
+            </a:graphic>
+          </wp:inline>
+        </w:drawing>
+      </w:r>
+    </w:p>
+    <w:p/>
     <w:sectPr>
       <w:pgSz w:w="11906" w:h="16838"/>
-      <w:pgMar w:top="1417" w:right="1701" w:bottom="1417" w:left="1701" w:header="708" w:footer="708" w:gutter="0"/>
+      <w:pgMar w:top="1440" w:right="1440" w:bottom="1440" w:left="1440" w:header="708" w:footer="708" w:gutter="0"/>
       <w:cols w:space="708"/>
       <w:docGrid w:linePitch="360"/>
     </w:sectPr>
@@ -689,7 +1199,7 @@
 <file path=word/numbering.xml><?xml version="1.0" encoding="utf-8"?>
 <w:numbering xmlns:wpc="http://schemas.microsoft.com/office/word/2010/wordprocessingCanvas" xmlns:cx="http://schemas.microsoft.com/office/drawing/2014/chartex" xmlns:cx1="http://schemas.microsoft.com/office/drawing/2015/9/8/chartex" xmlns:cx2="http://schemas.microsoft.com/office/drawing/2015/10/21/chartex" xmlns:cx3="http://schemas.microsoft.com/office/drawing/2016/5/9/chartex" xmlns:cx4="http://schemas.microsoft.com/office/drawing/2016/5/10/chartex" xmlns:cx5="http://schemas.microsoft.com/office/drawing/2016/5/11/chartex" xmlns:cx6="http://schemas.microsoft.com/office/drawing/2016/5/12/chartex" xmlns:cx7="http://schemas.microsoft.com/office/drawing/2016/5/13/chartex" xmlns:cx8="http://schemas.microsoft.com/office/drawing/2016/5/14/chartex" xmlns:mc="http://schemas.openxmlformats.org/markup-compatibility/2006" xmlns:aink="http://schemas.microsoft.com/office/drawing/2016/ink" xmlns:am3d="http://schemas.microsoft.com/office/drawing/2017/model3d" xmlns:o="urn:schemas-microsoft-com:office:office" xmlns:oel="http://schemas.microsoft.com/office/2019/extlst" xmlns:r="http://schemas.openxmlformats.org/officeDocument/2006/relationships" xmlns:m="http://schemas.openxmlformats.org/officeDocument/2006/math" xmlns:v="urn:schemas-microsoft-com:vml" xmlns:wp14="http://schemas.microsoft.com/office/word/2010/wordprocessingDrawing" xmlns:wp="http://schemas.openxmlformats.org/drawingml/2006/wordprocessingDrawing" xmlns:w10="urn:schemas-microsoft-com:office:word" xmlns:w="http://schemas.openxmlformats.org/wordprocessingml/2006/main" xmlns:w14="http://schemas.microsoft.com/office/word/2010/wordml" xmlns:w15="http://schemas.microsoft.com/office/word/2012/wordml" xmlns:w16cex="http://schemas.microsoft.com/office/word/2018/wordml/cex" xmlns:w16cid="http://schemas.microsoft.com/office/word/2016/wordml/cid" xmlns:w16="http://schemas.microsoft.com/office/word/2018/wordml" xmlns:w16du="http://schemas.microsoft.com/office/word/2023/wordml/word16du" xmlns:w16sdtdh="http://schemas.microsoft.com/office/word/2020/wordml/sdtdatahash" xmlns:w16sdtfl="http://schemas.microsoft.com/office/word/2024/wordml/sdtformatlock" xmlns:w16se="http://schemas.microsoft.com/office/word/2015/wordml/symex" xmlns:wpg="http://schemas.microsoft.com/office/word/2010/wordprocessingGroup" xmlns:wpi="http://schemas.microsoft.com/office/word/2010/wordprocessingInk" xmlns:wne="http://schemas.microsoft.com/office/word/2006/wordml" xmlns:wps="http://schemas.microsoft.com/office/word/2010/wordprocessingShape" mc:Ignorable="w14 w15 w16se w16cid w16 w16cex w16sdtdh w16sdtfl w16du wp14">
   <w:abstractNum w:abstractNumId="0" w15:restartNumberingAfterBreak="0">
-    <w:nsid w:val="629547A8"/>
+    <w:nsid w:val="60253DC7"/>
     <w:multiLevelType w:val="singleLevel"/>
     <w:tmpl w:val="580A000F"/>
     <w:lvl w:ilvl="0">
@@ -702,7 +1212,7 @@
       </w:pPr>
     </w:lvl>
   </w:abstractNum>
-  <w:num w:numId="1" w16cid:durableId="393282128">
+  <w:num w:numId="1" w16cid:durableId="1513834019">
     <w:abstractNumId w:val="0"/>
   </w:num>
 </w:numbering>
@@ -1108,6 +1618,12 @@
   <w:style w:type="paragraph" w:default="1" w:styleId="Normal">
     <w:name w:val="Normal"/>
     <w:qFormat/>
+    <w:pPr>
+      <w:spacing w:after="0" w:line="480" w:lineRule="auto"/>
+    </w:pPr>
+    <w:rPr>
+      <w:rFonts w:ascii="Times New Roman" w:hAnsi="Times New Roman"/>
+    </w:rPr>
   </w:style>
   <w:style w:type="paragraph" w:styleId="Ttulo1">
     <w:name w:val="heading 1"/>
@@ -1116,7 +1632,7 @@
     <w:link w:val="Ttulo1Car"/>
     <w:uiPriority w:val="9"/>
     <w:qFormat/>
-    <w:rsid w:val="005C48F3"/>
+    <w:rsid w:val="006628C7"/>
     <w:pPr>
       <w:keepNext/>
       <w:keepLines/>
@@ -1139,7 +1655,7 @@
     <w:semiHidden/>
     <w:unhideWhenUsed/>
     <w:qFormat/>
-    <w:rsid w:val="005C48F3"/>
+    <w:rsid w:val="006628C7"/>
     <w:pPr>
       <w:keepNext/>
       <w:keepLines/>
@@ -1162,7 +1678,7 @@
     <w:semiHidden/>
     <w:unhideWhenUsed/>
     <w:qFormat/>
-    <w:rsid w:val="005C48F3"/>
+    <w:rsid w:val="006628C7"/>
     <w:pPr>
       <w:keepNext/>
       <w:keepLines/>
@@ -1185,7 +1701,7 @@
     <w:semiHidden/>
     <w:unhideWhenUsed/>
     <w:qFormat/>
-    <w:rsid w:val="005C48F3"/>
+    <w:rsid w:val="006628C7"/>
     <w:pPr>
       <w:keepNext/>
       <w:keepLines/>
@@ -1208,7 +1724,7 @@
     <w:semiHidden/>
     <w:unhideWhenUsed/>
     <w:qFormat/>
-    <w:rsid w:val="005C48F3"/>
+    <w:rsid w:val="006628C7"/>
     <w:pPr>
       <w:keepNext/>
       <w:keepLines/>
@@ -1229,11 +1745,11 @@
     <w:semiHidden/>
     <w:unhideWhenUsed/>
     <w:qFormat/>
-    <w:rsid w:val="005C48F3"/>
+    <w:rsid w:val="006628C7"/>
     <w:pPr>
       <w:keepNext/>
       <w:keepLines/>
-      <w:spacing w:before="40" w:after="0"/>
+      <w:spacing w:before="40"/>
       <w:outlineLvl w:val="5"/>
     </w:pPr>
     <w:rPr>
@@ -1252,11 +1768,11 @@
     <w:semiHidden/>
     <w:unhideWhenUsed/>
     <w:qFormat/>
-    <w:rsid w:val="005C48F3"/>
+    <w:rsid w:val="006628C7"/>
     <w:pPr>
       <w:keepNext/>
       <w:keepLines/>
-      <w:spacing w:before="40" w:after="0"/>
+      <w:spacing w:before="40"/>
       <w:outlineLvl w:val="6"/>
     </w:pPr>
     <w:rPr>
@@ -1273,11 +1789,10 @@
     <w:semiHidden/>
     <w:unhideWhenUsed/>
     <w:qFormat/>
-    <w:rsid w:val="005C48F3"/>
+    <w:rsid w:val="006628C7"/>
     <w:pPr>
       <w:keepNext/>
       <w:keepLines/>
-      <w:spacing w:after="0"/>
       <w:outlineLvl w:val="7"/>
     </w:pPr>
     <w:rPr>
@@ -1296,11 +1811,10 @@
     <w:semiHidden/>
     <w:unhideWhenUsed/>
     <w:qFormat/>
-    <w:rsid w:val="005C48F3"/>
+    <w:rsid w:val="006628C7"/>
     <w:pPr>
       <w:keepNext/>
       <w:keepLines/>
-      <w:spacing w:after="0"/>
       <w:outlineLvl w:val="8"/>
     </w:pPr>
     <w:rPr>
@@ -1340,7 +1854,7 @@
     <w:basedOn w:val="Fuentedeprrafopredeter"/>
     <w:link w:val="Ttulo1"/>
     <w:uiPriority w:val="9"/>
-    <w:rsid w:val="005C48F3"/>
+    <w:rsid w:val="006628C7"/>
     <w:rPr>
       <w:rFonts w:asciiTheme="majorHAnsi" w:eastAsiaTheme="majorEastAsia" w:hAnsiTheme="majorHAnsi" w:cstheme="majorBidi"/>
       <w:color w:val="0F4761" w:themeColor="accent1" w:themeShade="BF"/>
@@ -1354,7 +1868,7 @@
     <w:link w:val="Ttulo2"/>
     <w:uiPriority w:val="9"/>
     <w:semiHidden/>
-    <w:rsid w:val="005C48F3"/>
+    <w:rsid w:val="006628C7"/>
     <w:rPr>
       <w:rFonts w:asciiTheme="majorHAnsi" w:eastAsiaTheme="majorEastAsia" w:hAnsiTheme="majorHAnsi" w:cstheme="majorBidi"/>
       <w:color w:val="0F4761" w:themeColor="accent1" w:themeShade="BF"/>
@@ -1368,7 +1882,7 @@
     <w:link w:val="Ttulo3"/>
     <w:uiPriority w:val="9"/>
     <w:semiHidden/>
-    <w:rsid w:val="005C48F3"/>
+    <w:rsid w:val="006628C7"/>
     <w:rPr>
       <w:rFonts w:eastAsiaTheme="majorEastAsia" w:cstheme="majorBidi"/>
       <w:color w:val="0F4761" w:themeColor="accent1" w:themeShade="BF"/>
@@ -1382,7 +1896,7 @@
     <w:link w:val="Ttulo4"/>
     <w:uiPriority w:val="9"/>
     <w:semiHidden/>
-    <w:rsid w:val="005C48F3"/>
+    <w:rsid w:val="006628C7"/>
     <w:rPr>
       <w:rFonts w:eastAsiaTheme="majorEastAsia" w:cstheme="majorBidi"/>
       <w:i/>
@@ -1396,7 +1910,7 @@
     <w:link w:val="Ttulo5"/>
     <w:uiPriority w:val="9"/>
     <w:semiHidden/>
-    <w:rsid w:val="005C48F3"/>
+    <w:rsid w:val="006628C7"/>
     <w:rPr>
       <w:rFonts w:eastAsiaTheme="majorEastAsia" w:cstheme="majorBidi"/>
       <w:color w:val="0F4761" w:themeColor="accent1" w:themeShade="BF"/>
@@ -1408,7 +1922,7 @@
     <w:link w:val="Ttulo6"/>
     <w:uiPriority w:val="9"/>
     <w:semiHidden/>
-    <w:rsid w:val="005C48F3"/>
+    <w:rsid w:val="006628C7"/>
     <w:rPr>
       <w:rFonts w:eastAsiaTheme="majorEastAsia" w:cstheme="majorBidi"/>
       <w:i/>
@@ -1422,7 +1936,7 @@
     <w:link w:val="Ttulo7"/>
     <w:uiPriority w:val="9"/>
     <w:semiHidden/>
-    <w:rsid w:val="005C48F3"/>
+    <w:rsid w:val="006628C7"/>
     <w:rPr>
       <w:rFonts w:eastAsiaTheme="majorEastAsia" w:cstheme="majorBidi"/>
       <w:color w:val="595959" w:themeColor="text1" w:themeTint="A6"/>
@@ -1434,7 +1948,7 @@
     <w:link w:val="Ttulo8"/>
     <w:uiPriority w:val="9"/>
     <w:semiHidden/>
-    <w:rsid w:val="005C48F3"/>
+    <w:rsid w:val="006628C7"/>
     <w:rPr>
       <w:rFonts w:eastAsiaTheme="majorEastAsia" w:cstheme="majorBidi"/>
       <w:i/>
@@ -1448,7 +1962,7 @@
     <w:link w:val="Ttulo9"/>
     <w:uiPriority w:val="9"/>
     <w:semiHidden/>
-    <w:rsid w:val="005C48F3"/>
+    <w:rsid w:val="006628C7"/>
     <w:rPr>
       <w:rFonts w:eastAsiaTheme="majorEastAsia" w:cstheme="majorBidi"/>
       <w:color w:val="272727" w:themeColor="text1" w:themeTint="D8"/>
@@ -1461,7 +1975,7 @@
     <w:link w:val="TtuloCar"/>
     <w:uiPriority w:val="10"/>
     <w:qFormat/>
-    <w:rsid w:val="005C48F3"/>
+    <w:rsid w:val="006628C7"/>
     <w:pPr>
       <w:spacing w:after="80" w:line="240" w:lineRule="auto"/>
       <w:contextualSpacing/>
@@ -1479,7 +1993,7 @@
     <w:basedOn w:val="Fuentedeprrafopredeter"/>
     <w:link w:val="Ttulo"/>
     <w:uiPriority w:val="10"/>
-    <w:rsid w:val="005C48F3"/>
+    <w:rsid w:val="006628C7"/>
     <w:rPr>
       <w:rFonts w:asciiTheme="majorHAnsi" w:eastAsiaTheme="majorEastAsia" w:hAnsiTheme="majorHAnsi" w:cstheme="majorBidi"/>
       <w:spacing w:val="-10"/>
@@ -1495,7 +2009,7 @@
     <w:link w:val="SubttuloCar"/>
     <w:uiPriority w:val="11"/>
     <w:qFormat/>
-    <w:rsid w:val="005C48F3"/>
+    <w:rsid w:val="006628C7"/>
     <w:pPr>
       <w:numPr>
         <w:ilvl w:val="1"/>
@@ -1514,7 +2028,7 @@
     <w:basedOn w:val="Fuentedeprrafopredeter"/>
     <w:link w:val="Subttulo"/>
     <w:uiPriority w:val="11"/>
-    <w:rsid w:val="005C48F3"/>
+    <w:rsid w:val="006628C7"/>
     <w:rPr>
       <w:rFonts w:eastAsiaTheme="majorEastAsia" w:cstheme="majorBidi"/>
       <w:color w:val="595959" w:themeColor="text1" w:themeTint="A6"/>
@@ -1530,7 +2044,7 @@
     <w:link w:val="CitaCar"/>
     <w:uiPriority w:val="29"/>
     <w:qFormat/>
-    <w:rsid w:val="005C48F3"/>
+    <w:rsid w:val="006628C7"/>
     <w:pPr>
       <w:spacing w:before="160"/>
       <w:jc w:val="center"/>
@@ -1546,7 +2060,7 @@
     <w:basedOn w:val="Fuentedeprrafopredeter"/>
     <w:link w:val="Cita"/>
     <w:uiPriority w:val="29"/>
-    <w:rsid w:val="005C48F3"/>
+    <w:rsid w:val="006628C7"/>
     <w:rPr>
       <w:i/>
       <w:iCs/>
@@ -1558,7 +2072,7 @@
     <w:basedOn w:val="Normal"/>
     <w:uiPriority w:val="34"/>
     <w:qFormat/>
-    <w:rsid w:val="005C48F3"/>
+    <w:rsid w:val="006628C7"/>
     <w:pPr>
       <w:ind w:left="720"/>
       <w:contextualSpacing/>
@@ -1569,7 +2083,7 @@
     <w:basedOn w:val="Fuentedeprrafopredeter"/>
     <w:uiPriority w:val="21"/>
     <w:qFormat/>
-    <w:rsid w:val="005C48F3"/>
+    <w:rsid w:val="006628C7"/>
     <w:rPr>
       <w:i/>
       <w:iCs/>
@@ -1583,7 +2097,7 @@
     <w:link w:val="CitadestacadaCar"/>
     <w:uiPriority w:val="30"/>
     <w:qFormat/>
-    <w:rsid w:val="005C48F3"/>
+    <w:rsid w:val="006628C7"/>
     <w:pPr>
       <w:pBdr>
         <w:top w:val="single" w:sz="4" w:space="10" w:color="0F4761" w:themeColor="accent1" w:themeShade="BF"/>
@@ -1604,7 +2118,7 @@
     <w:basedOn w:val="Fuentedeprrafopredeter"/>
     <w:link w:val="Citadestacada"/>
     <w:uiPriority w:val="30"/>
-    <w:rsid w:val="005C48F3"/>
+    <w:rsid w:val="006628C7"/>
     <w:rPr>
       <w:i/>
       <w:iCs/>
@@ -1616,7 +2130,7 @@
     <w:basedOn w:val="Fuentedeprrafopredeter"/>
     <w:uiPriority w:val="32"/>
     <w:qFormat/>
-    <w:rsid w:val="005C48F3"/>
+    <w:rsid w:val="006628C7"/>
     <w:rPr>
       <w:b/>
       <w:bCs/>

</xml_diff>

<commit_message>
docs: record verified Argo CD deployment status
</commit_message>
<xml_diff>
--- a/docs/Actividad_1_Laboratorio_Tecnico.docx
+++ b/docs/Actividad_1_Laboratorio_Tecnico.docx
@@ -598,44 +598,30 @@
           <w:b/>
           <w:sz w:val="24"/>
         </w:rPr>
-        <w:t>Reflexion</w:t>
-      </w:r>
-    </w:p>
-    <w:p>
-      <w:pPr>
-        <w:rPr>
-          <w:rFonts w:ascii="Consolas" w:hAnsi="Consolas"/>
-          <w:sz w:val="18"/>
-        </w:rPr>
-      </w:pPr>
-    </w:p>
-    <w:p>
-      <w:pPr>
-        <w:rPr>
-          <w:rFonts w:ascii="Consolas" w:hAnsi="Consolas"/>
-          <w:sz w:val="18"/>
-        </w:rPr>
-      </w:pPr>
-      <w:r>
-        <w:rPr>
-          <w:rFonts w:ascii="Consolas" w:hAnsi="Consolas"/>
-          <w:sz w:val="18"/>
-        </w:rPr>
-        <w:t>Separar CI, CD, GitOps y observabilidad disminuye el riesgo operacional. GitHub Actions detecta defectos cerca del cambio; Jenkins construye un artefacto trazable; Helm convierte configuracion en manifiestos repetibles; Argo CD evita credenciales de Kubernetes dentro del pipeline; y Prometheus/Grafana convierten el comportamiento en produccion en una se</w:t>
-      </w:r>
-      <w:r>
-        <w:rPr>
-          <w:rFonts w:ascii="Consolas" w:hAnsi="Consolas" w:hint="eastAsia"/>
-          <w:sz w:val="18"/>
-        </w:rPr>
-        <w:t>ñ</w:t>
-      </w:r>
-      <w:r>
-        <w:rPr>
-          <w:rFonts w:ascii="Consolas" w:hAnsi="Consolas"/>
-          <w:sz w:val="18"/>
-        </w:rPr>
-        <w:t>al observable. El principal aprendizaje es que automatizar el despliegue no es suficiente: un flujo maduro requiere controles de seguridad, trazabilidad de imagen y monitoreo posterior a la liberacion, una relacion coherente con la disciplina SRE (Google, n.d.).</w:t>
+        <w:t>Estado de despliegue y mejora pendiente</w:t>
+      </w:r>
+    </w:p>
+    <w:p>
+      <w:pPr>
+        <w:rPr>
+          <w:rFonts w:ascii="Consolas" w:hAnsi="Consolas"/>
+          <w:sz w:val="18"/>
+        </w:rPr>
+      </w:pPr>
+    </w:p>
+    <w:p>
+      <w:pPr>
+        <w:rPr>
+          <w:rFonts w:ascii="Consolas" w:hAnsi="Consolas"/>
+          <w:sz w:val="18"/>
+        </w:rPr>
+      </w:pPr>
+      <w:r>
+        <w:rPr>
+          <w:rFonts w:ascii="Consolas" w:hAnsi="Consolas"/>
+          <w:sz w:val="18"/>
+        </w:rPr>
+        <w:t>La validacion del flujo encontro una condicion de integracion concreta: Argo CD sincronizo la revision de Git, pero el pod nuevo no puede cumplir `runAsNonRoot` porque la etiqueta remota `yulietrojas/mi-microservicio:latest` contiene una imagen previa que se ejecuta como root. El Dockerfile del repositorio fue endurecido con una imagen runtime distroless y usuario `nonroot:nonroot`; la mejora queda lista para publicacion. Para cerrar el ciclo GitOps con estado `Healthy`, Jenkins debe publicar esta nueva imagen usando una credencial de Docker Hub que tenga permiso para escribir en `yulietrojas/mi-microservicio` y actualizar el tag de `values-dev.yaml`.</w:t>
       </w:r>
     </w:p>
     <w:p>
@@ -662,6 +648,70 @@
           <w:b/>
           <w:sz w:val="24"/>
         </w:rPr>
+        <w:t>Reflexion</w:t>
+      </w:r>
+    </w:p>
+    <w:p>
+      <w:pPr>
+        <w:rPr>
+          <w:rFonts w:ascii="Consolas" w:hAnsi="Consolas"/>
+          <w:sz w:val="18"/>
+        </w:rPr>
+      </w:pPr>
+    </w:p>
+    <w:p>
+      <w:pPr>
+        <w:rPr>
+          <w:rFonts w:ascii="Consolas" w:hAnsi="Consolas"/>
+          <w:sz w:val="18"/>
+        </w:rPr>
+      </w:pPr>
+      <w:r>
+        <w:rPr>
+          <w:rFonts w:ascii="Consolas" w:hAnsi="Consolas"/>
+          <w:sz w:val="18"/>
+        </w:rPr>
+        <w:t>Separar CI, CD, GitOps y observabilidad disminuye el riesgo operacional. GitHub Actions detecta defectos cerca del cambio; Jenkins construye un artefacto trazable; Helm convierte configuracion en manifiestos repetibles; Argo CD evita credenciales de Kubernetes dentro del pipeline; y Prometheus/Grafana convierten el comportamiento en produccion en una se</w:t>
+      </w:r>
+      <w:r>
+        <w:rPr>
+          <w:rFonts w:ascii="Consolas" w:hAnsi="Consolas" w:hint="eastAsia"/>
+          <w:sz w:val="18"/>
+        </w:rPr>
+        <w:t>ñ</w:t>
+      </w:r>
+      <w:r>
+        <w:rPr>
+          <w:rFonts w:ascii="Consolas" w:hAnsi="Consolas"/>
+          <w:sz w:val="18"/>
+        </w:rPr>
+        <w:t>al observable. El principal aprendizaje es que automatizar el despliegue no es suficiente: un flujo maduro requiere controles de seguridad, trazabilidad de imagen y monitoreo posterior a la liberacion, una relacion coherente con la disciplina SRE (Google, n.d.).</w:t>
+      </w:r>
+    </w:p>
+    <w:p>
+      <w:pPr>
+        <w:rPr>
+          <w:rFonts w:ascii="Consolas" w:hAnsi="Consolas"/>
+          <w:sz w:val="18"/>
+        </w:rPr>
+      </w:pPr>
+    </w:p>
+    <w:p>
+      <w:pPr>
+        <w:pStyle w:val="Ttulo1"/>
+        <w:jc w:val="center"/>
+        <w:rPr>
+          <w:rFonts w:ascii="Times New Roman" w:hAnsi="Times New Roman" w:cs="Times New Roman"/>
+          <w:b/>
+          <w:sz w:val="24"/>
+        </w:rPr>
+      </w:pPr>
+      <w:r>
+        <w:rPr>
+          <w:rFonts w:ascii="Times New Roman" w:hAnsi="Times New Roman" w:cs="Times New Roman"/>
+          <w:b/>
+          <w:sz w:val="24"/>
+        </w:rPr>
         <w:t>Referencias</w:t>
       </w:r>
     </w:p>
@@ -817,16 +867,16 @@
           <w:noProof/>
         </w:rPr>
         <w:drawing>
-          <wp:inline distT="0" distB="0" distL="0" distR="0" wp14:anchorId="0D62AF91" wp14:editId="55844125">
+          <wp:inline distT="0" distB="0" distL="0" distR="0" wp14:anchorId="7D501ADF" wp14:editId="0E505FA8">
             <wp:extent cx="5842000" cy="3302000"/>
             <wp:effectExtent l="0" t="0" r="6350" b="0"/>
-            <wp:docPr id="358662574" name="Imagen 1"/>
+            <wp:docPr id="1169979593" name="Imagen 1"/>
             <wp:cNvGraphicFramePr/>
             <a:graphic xmlns:a="http://schemas.openxmlformats.org/drawingml/2006/main">
               <a:graphicData uri="http://schemas.openxmlformats.org/drawingml/2006/picture">
                 <pic:pic xmlns:pic="http://schemas.openxmlformats.org/drawingml/2006/picture">
                   <pic:nvPicPr>
-                    <pic:cNvPr id="358662574" name=""/>
+                    <pic:cNvPr id="1169979593" name=""/>
                     <pic:cNvPicPr/>
                   </pic:nvPicPr>
                   <pic:blipFill>
@@ -901,16 +951,16 @@
           <w:noProof/>
         </w:rPr>
         <w:drawing>
-          <wp:inline distT="0" distB="0" distL="0" distR="0" wp14:anchorId="1AFB2F8B" wp14:editId="75263320">
+          <wp:inline distT="0" distB="0" distL="0" distR="0" wp14:anchorId="799D5EA0" wp14:editId="477C803C">
             <wp:extent cx="5842000" cy="4064000"/>
             <wp:effectExtent l="0" t="0" r="6350" b="0"/>
-            <wp:docPr id="2078312084" name="Imagen 1"/>
+            <wp:docPr id="840177473" name="Imagen 1"/>
             <wp:cNvGraphicFramePr/>
             <a:graphic xmlns:a="http://schemas.openxmlformats.org/drawingml/2006/main">
               <a:graphicData uri="http://schemas.openxmlformats.org/drawingml/2006/picture">
                 <pic:pic xmlns:pic="http://schemas.openxmlformats.org/drawingml/2006/picture">
                   <pic:nvPicPr>
-                    <pic:cNvPr id="2078312084" name=""/>
+                    <pic:cNvPr id="840177473" name=""/>
                     <pic:cNvPicPr/>
                   </pic:nvPicPr>
                   <pic:blipFill>
@@ -962,16 +1012,16 @@
           <w:noProof/>
         </w:rPr>
         <w:drawing>
-          <wp:inline distT="0" distB="0" distL="0" distR="0" wp14:anchorId="2090D0E9" wp14:editId="2292CF44">
+          <wp:inline distT="0" distB="0" distL="0" distR="0" wp14:anchorId="5235EEB6" wp14:editId="12A7B94D">
             <wp:extent cx="5842000" cy="3788410"/>
             <wp:effectExtent l="0" t="0" r="6350" b="2540"/>
-            <wp:docPr id="117694024" name="Imagen 2"/>
+            <wp:docPr id="854329655" name="Imagen 2"/>
             <wp:cNvGraphicFramePr/>
             <a:graphic xmlns:a="http://schemas.openxmlformats.org/drawingml/2006/main">
               <a:graphicData uri="http://schemas.openxmlformats.org/drawingml/2006/picture">
                 <pic:pic xmlns:pic="http://schemas.openxmlformats.org/drawingml/2006/picture">
                   <pic:nvPicPr>
-                    <pic:cNvPr id="117694024" name=""/>
+                    <pic:cNvPr id="854329655" name=""/>
                     <pic:cNvPicPr/>
                   </pic:nvPicPr>
                   <pic:blipFill>
@@ -1023,16 +1073,16 @@
           <w:noProof/>
         </w:rPr>
         <w:drawing>
-          <wp:inline distT="0" distB="0" distL="0" distR="0" wp14:anchorId="6434E370" wp14:editId="44F5BE50">
+          <wp:inline distT="0" distB="0" distL="0" distR="0" wp14:anchorId="315AD18D" wp14:editId="3DF59D7E">
             <wp:extent cx="5842000" cy="3788410"/>
             <wp:effectExtent l="0" t="0" r="6350" b="2540"/>
-            <wp:docPr id="562115853" name="Imagen 3"/>
+            <wp:docPr id="2091248597" name="Imagen 3"/>
             <wp:cNvGraphicFramePr/>
             <a:graphic xmlns:a="http://schemas.openxmlformats.org/drawingml/2006/main">
               <a:graphicData uri="http://schemas.openxmlformats.org/drawingml/2006/picture">
                 <pic:pic xmlns:pic="http://schemas.openxmlformats.org/drawingml/2006/picture">
                   <pic:nvPicPr>
-                    <pic:cNvPr id="562115853" name=""/>
+                    <pic:cNvPr id="2091248597" name=""/>
                     <pic:cNvPicPr/>
                   </pic:nvPicPr>
                   <pic:blipFill>
@@ -1084,16 +1134,16 @@
           <w:noProof/>
         </w:rPr>
         <w:drawing>
-          <wp:inline distT="0" distB="0" distL="0" distR="0" wp14:anchorId="3652C9C3" wp14:editId="2B8268A8">
+          <wp:inline distT="0" distB="0" distL="0" distR="0" wp14:anchorId="574D94F6" wp14:editId="2F8FE29E">
             <wp:extent cx="5842000" cy="4064000"/>
             <wp:effectExtent l="0" t="0" r="6350" b="0"/>
-            <wp:docPr id="965308562" name="Imagen 4"/>
+            <wp:docPr id="1955968080" name="Imagen 4"/>
             <wp:cNvGraphicFramePr/>
             <a:graphic xmlns:a="http://schemas.openxmlformats.org/drawingml/2006/main">
               <a:graphicData uri="http://schemas.openxmlformats.org/drawingml/2006/picture">
                 <pic:pic xmlns:pic="http://schemas.openxmlformats.org/drawingml/2006/picture">
                   <pic:nvPicPr>
-                    <pic:cNvPr id="965308562" name=""/>
+                    <pic:cNvPr id="1955968080" name=""/>
                     <pic:cNvPicPr/>
                   </pic:nvPicPr>
                   <pic:blipFill>
@@ -1145,16 +1195,16 @@
           <w:noProof/>
         </w:rPr>
         <w:drawing>
-          <wp:inline distT="0" distB="0" distL="0" distR="0" wp14:anchorId="34BCADC8" wp14:editId="2323B278">
+          <wp:inline distT="0" distB="0" distL="0" distR="0" wp14:anchorId="2B3B5EB8" wp14:editId="168CB887">
             <wp:extent cx="5842000" cy="3788410"/>
             <wp:effectExtent l="0" t="0" r="6350" b="2540"/>
-            <wp:docPr id="182892795" name="Imagen 5"/>
+            <wp:docPr id="431168575" name="Imagen 5"/>
             <wp:cNvGraphicFramePr/>
             <a:graphic xmlns:a="http://schemas.openxmlformats.org/drawingml/2006/main">
               <a:graphicData uri="http://schemas.openxmlformats.org/drawingml/2006/picture">
                 <pic:pic xmlns:pic="http://schemas.openxmlformats.org/drawingml/2006/picture">
                   <pic:nvPicPr>
-                    <pic:cNvPr id="182892795" name=""/>
+                    <pic:cNvPr id="431168575" name=""/>
                     <pic:cNvPicPr/>
                   </pic:nvPicPr>
                   <pic:blipFill>
@@ -1199,7 +1249,7 @@
 <file path=word/numbering.xml><?xml version="1.0" encoding="utf-8"?>
 <w:numbering xmlns:wpc="http://schemas.microsoft.com/office/word/2010/wordprocessingCanvas" xmlns:cx="http://schemas.microsoft.com/office/drawing/2014/chartex" xmlns:cx1="http://schemas.microsoft.com/office/drawing/2015/9/8/chartex" xmlns:cx2="http://schemas.microsoft.com/office/drawing/2015/10/21/chartex" xmlns:cx3="http://schemas.microsoft.com/office/drawing/2016/5/9/chartex" xmlns:cx4="http://schemas.microsoft.com/office/drawing/2016/5/10/chartex" xmlns:cx5="http://schemas.microsoft.com/office/drawing/2016/5/11/chartex" xmlns:cx6="http://schemas.microsoft.com/office/drawing/2016/5/12/chartex" xmlns:cx7="http://schemas.microsoft.com/office/drawing/2016/5/13/chartex" xmlns:cx8="http://schemas.microsoft.com/office/drawing/2016/5/14/chartex" xmlns:mc="http://schemas.openxmlformats.org/markup-compatibility/2006" xmlns:aink="http://schemas.microsoft.com/office/drawing/2016/ink" xmlns:am3d="http://schemas.microsoft.com/office/drawing/2017/model3d" xmlns:o="urn:schemas-microsoft-com:office:office" xmlns:oel="http://schemas.microsoft.com/office/2019/extlst" xmlns:r="http://schemas.openxmlformats.org/officeDocument/2006/relationships" xmlns:m="http://schemas.openxmlformats.org/officeDocument/2006/math" xmlns:v="urn:schemas-microsoft-com:vml" xmlns:wp14="http://schemas.microsoft.com/office/word/2010/wordprocessingDrawing" xmlns:wp="http://schemas.openxmlformats.org/drawingml/2006/wordprocessingDrawing" xmlns:w10="urn:schemas-microsoft-com:office:word" xmlns:w="http://schemas.openxmlformats.org/wordprocessingml/2006/main" xmlns:w14="http://schemas.microsoft.com/office/word/2010/wordml" xmlns:w15="http://schemas.microsoft.com/office/word/2012/wordml" xmlns:w16cex="http://schemas.microsoft.com/office/word/2018/wordml/cex" xmlns:w16cid="http://schemas.microsoft.com/office/word/2016/wordml/cid" xmlns:w16="http://schemas.microsoft.com/office/word/2018/wordml" xmlns:w16du="http://schemas.microsoft.com/office/word/2023/wordml/word16du" xmlns:w16sdtdh="http://schemas.microsoft.com/office/word/2020/wordml/sdtdatahash" xmlns:w16sdtfl="http://schemas.microsoft.com/office/word/2024/wordml/sdtformatlock" xmlns:w16se="http://schemas.microsoft.com/office/word/2015/wordml/symex" xmlns:wpg="http://schemas.microsoft.com/office/word/2010/wordprocessingGroup" xmlns:wpi="http://schemas.microsoft.com/office/word/2010/wordprocessingInk" xmlns:wne="http://schemas.microsoft.com/office/word/2006/wordml" xmlns:wps="http://schemas.microsoft.com/office/word/2010/wordprocessingShape" mc:Ignorable="w14 w15 w16se w16cid w16 w16cex w16sdtdh w16sdtfl w16du wp14">
   <w:abstractNum w:abstractNumId="0" w15:restartNumberingAfterBreak="0">
-    <w:nsid w:val="60253DC7"/>
+    <w:nsid w:val="26F53A99"/>
     <w:multiLevelType w:val="singleLevel"/>
     <w:tmpl w:val="580A000F"/>
     <w:lvl w:ilvl="0">
@@ -1212,7 +1262,7 @@
       </w:pPr>
     </w:lvl>
   </w:abstractNum>
-  <w:num w:numId="1" w16cid:durableId="1513834019">
+  <w:num w:numId="1" w16cid:durableId="1528523079">
     <w:abstractNumId w:val="0"/>
   </w:num>
 </w:numbering>
@@ -1632,7 +1682,7 @@
     <w:link w:val="Ttulo1Car"/>
     <w:uiPriority w:val="9"/>
     <w:qFormat/>
-    <w:rsid w:val="006628C7"/>
+    <w:rsid w:val="00BE4BEF"/>
     <w:pPr>
       <w:keepNext/>
       <w:keepLines/>
@@ -1655,7 +1705,7 @@
     <w:semiHidden/>
     <w:unhideWhenUsed/>
     <w:qFormat/>
-    <w:rsid w:val="006628C7"/>
+    <w:rsid w:val="00BE4BEF"/>
     <w:pPr>
       <w:keepNext/>
       <w:keepLines/>
@@ -1678,7 +1728,7 @@
     <w:semiHidden/>
     <w:unhideWhenUsed/>
     <w:qFormat/>
-    <w:rsid w:val="006628C7"/>
+    <w:rsid w:val="00BE4BEF"/>
     <w:pPr>
       <w:keepNext/>
       <w:keepLines/>
@@ -1701,7 +1751,7 @@
     <w:semiHidden/>
     <w:unhideWhenUsed/>
     <w:qFormat/>
-    <w:rsid w:val="006628C7"/>
+    <w:rsid w:val="00BE4BEF"/>
     <w:pPr>
       <w:keepNext/>
       <w:keepLines/>
@@ -1724,7 +1774,7 @@
     <w:semiHidden/>
     <w:unhideWhenUsed/>
     <w:qFormat/>
-    <w:rsid w:val="006628C7"/>
+    <w:rsid w:val="00BE4BEF"/>
     <w:pPr>
       <w:keepNext/>
       <w:keepLines/>
@@ -1745,7 +1795,7 @@
     <w:semiHidden/>
     <w:unhideWhenUsed/>
     <w:qFormat/>
-    <w:rsid w:val="006628C7"/>
+    <w:rsid w:val="00BE4BEF"/>
     <w:pPr>
       <w:keepNext/>
       <w:keepLines/>
@@ -1768,7 +1818,7 @@
     <w:semiHidden/>
     <w:unhideWhenUsed/>
     <w:qFormat/>
-    <w:rsid w:val="006628C7"/>
+    <w:rsid w:val="00BE4BEF"/>
     <w:pPr>
       <w:keepNext/>
       <w:keepLines/>
@@ -1789,7 +1839,7 @@
     <w:semiHidden/>
     <w:unhideWhenUsed/>
     <w:qFormat/>
-    <w:rsid w:val="006628C7"/>
+    <w:rsid w:val="00BE4BEF"/>
     <w:pPr>
       <w:keepNext/>
       <w:keepLines/>
@@ -1811,7 +1861,7 @@
     <w:semiHidden/>
     <w:unhideWhenUsed/>
     <w:qFormat/>
-    <w:rsid w:val="006628C7"/>
+    <w:rsid w:val="00BE4BEF"/>
     <w:pPr>
       <w:keepNext/>
       <w:keepLines/>
@@ -1854,7 +1904,7 @@
     <w:basedOn w:val="Fuentedeprrafopredeter"/>
     <w:link w:val="Ttulo1"/>
     <w:uiPriority w:val="9"/>
-    <w:rsid w:val="006628C7"/>
+    <w:rsid w:val="00BE4BEF"/>
     <w:rPr>
       <w:rFonts w:asciiTheme="majorHAnsi" w:eastAsiaTheme="majorEastAsia" w:hAnsiTheme="majorHAnsi" w:cstheme="majorBidi"/>
       <w:color w:val="0F4761" w:themeColor="accent1" w:themeShade="BF"/>
@@ -1868,7 +1918,7 @@
     <w:link w:val="Ttulo2"/>
     <w:uiPriority w:val="9"/>
     <w:semiHidden/>
-    <w:rsid w:val="006628C7"/>
+    <w:rsid w:val="00BE4BEF"/>
     <w:rPr>
       <w:rFonts w:asciiTheme="majorHAnsi" w:eastAsiaTheme="majorEastAsia" w:hAnsiTheme="majorHAnsi" w:cstheme="majorBidi"/>
       <w:color w:val="0F4761" w:themeColor="accent1" w:themeShade="BF"/>
@@ -1882,7 +1932,7 @@
     <w:link w:val="Ttulo3"/>
     <w:uiPriority w:val="9"/>
     <w:semiHidden/>
-    <w:rsid w:val="006628C7"/>
+    <w:rsid w:val="00BE4BEF"/>
     <w:rPr>
       <w:rFonts w:eastAsiaTheme="majorEastAsia" w:cstheme="majorBidi"/>
       <w:color w:val="0F4761" w:themeColor="accent1" w:themeShade="BF"/>
@@ -1896,7 +1946,7 @@
     <w:link w:val="Ttulo4"/>
     <w:uiPriority w:val="9"/>
     <w:semiHidden/>
-    <w:rsid w:val="006628C7"/>
+    <w:rsid w:val="00BE4BEF"/>
     <w:rPr>
       <w:rFonts w:eastAsiaTheme="majorEastAsia" w:cstheme="majorBidi"/>
       <w:i/>
@@ -1910,7 +1960,7 @@
     <w:link w:val="Ttulo5"/>
     <w:uiPriority w:val="9"/>
     <w:semiHidden/>
-    <w:rsid w:val="006628C7"/>
+    <w:rsid w:val="00BE4BEF"/>
     <w:rPr>
       <w:rFonts w:eastAsiaTheme="majorEastAsia" w:cstheme="majorBidi"/>
       <w:color w:val="0F4761" w:themeColor="accent1" w:themeShade="BF"/>
@@ -1922,7 +1972,7 @@
     <w:link w:val="Ttulo6"/>
     <w:uiPriority w:val="9"/>
     <w:semiHidden/>
-    <w:rsid w:val="006628C7"/>
+    <w:rsid w:val="00BE4BEF"/>
     <w:rPr>
       <w:rFonts w:eastAsiaTheme="majorEastAsia" w:cstheme="majorBidi"/>
       <w:i/>
@@ -1936,7 +1986,7 @@
     <w:link w:val="Ttulo7"/>
     <w:uiPriority w:val="9"/>
     <w:semiHidden/>
-    <w:rsid w:val="006628C7"/>
+    <w:rsid w:val="00BE4BEF"/>
     <w:rPr>
       <w:rFonts w:eastAsiaTheme="majorEastAsia" w:cstheme="majorBidi"/>
       <w:color w:val="595959" w:themeColor="text1" w:themeTint="A6"/>
@@ -1948,7 +1998,7 @@
     <w:link w:val="Ttulo8"/>
     <w:uiPriority w:val="9"/>
     <w:semiHidden/>
-    <w:rsid w:val="006628C7"/>
+    <w:rsid w:val="00BE4BEF"/>
     <w:rPr>
       <w:rFonts w:eastAsiaTheme="majorEastAsia" w:cstheme="majorBidi"/>
       <w:i/>
@@ -1962,7 +2012,7 @@
     <w:link w:val="Ttulo9"/>
     <w:uiPriority w:val="9"/>
     <w:semiHidden/>
-    <w:rsid w:val="006628C7"/>
+    <w:rsid w:val="00BE4BEF"/>
     <w:rPr>
       <w:rFonts w:eastAsiaTheme="majorEastAsia" w:cstheme="majorBidi"/>
       <w:color w:val="272727" w:themeColor="text1" w:themeTint="D8"/>
@@ -1975,7 +2025,7 @@
     <w:link w:val="TtuloCar"/>
     <w:uiPriority w:val="10"/>
     <w:qFormat/>
-    <w:rsid w:val="006628C7"/>
+    <w:rsid w:val="00BE4BEF"/>
     <w:pPr>
       <w:spacing w:after="80" w:line="240" w:lineRule="auto"/>
       <w:contextualSpacing/>
@@ -1993,7 +2043,7 @@
     <w:basedOn w:val="Fuentedeprrafopredeter"/>
     <w:link w:val="Ttulo"/>
     <w:uiPriority w:val="10"/>
-    <w:rsid w:val="006628C7"/>
+    <w:rsid w:val="00BE4BEF"/>
     <w:rPr>
       <w:rFonts w:asciiTheme="majorHAnsi" w:eastAsiaTheme="majorEastAsia" w:hAnsiTheme="majorHAnsi" w:cstheme="majorBidi"/>
       <w:spacing w:val="-10"/>
@@ -2009,7 +2059,7 @@
     <w:link w:val="SubttuloCar"/>
     <w:uiPriority w:val="11"/>
     <w:qFormat/>
-    <w:rsid w:val="006628C7"/>
+    <w:rsid w:val="00BE4BEF"/>
     <w:pPr>
       <w:numPr>
         <w:ilvl w:val="1"/>
@@ -2028,7 +2078,7 @@
     <w:basedOn w:val="Fuentedeprrafopredeter"/>
     <w:link w:val="Subttulo"/>
     <w:uiPriority w:val="11"/>
-    <w:rsid w:val="006628C7"/>
+    <w:rsid w:val="00BE4BEF"/>
     <w:rPr>
       <w:rFonts w:eastAsiaTheme="majorEastAsia" w:cstheme="majorBidi"/>
       <w:color w:val="595959" w:themeColor="text1" w:themeTint="A6"/>
@@ -2044,7 +2094,7 @@
     <w:link w:val="CitaCar"/>
     <w:uiPriority w:val="29"/>
     <w:qFormat/>
-    <w:rsid w:val="006628C7"/>
+    <w:rsid w:val="00BE4BEF"/>
     <w:pPr>
       <w:spacing w:before="160"/>
       <w:jc w:val="center"/>
@@ -2060,7 +2110,7 @@
     <w:basedOn w:val="Fuentedeprrafopredeter"/>
     <w:link w:val="Cita"/>
     <w:uiPriority w:val="29"/>
-    <w:rsid w:val="006628C7"/>
+    <w:rsid w:val="00BE4BEF"/>
     <w:rPr>
       <w:i/>
       <w:iCs/>
@@ -2072,7 +2122,7 @@
     <w:basedOn w:val="Normal"/>
     <w:uiPriority w:val="34"/>
     <w:qFormat/>
-    <w:rsid w:val="006628C7"/>
+    <w:rsid w:val="00BE4BEF"/>
     <w:pPr>
       <w:ind w:left="720"/>
       <w:contextualSpacing/>
@@ -2083,7 +2133,7 @@
     <w:basedOn w:val="Fuentedeprrafopredeter"/>
     <w:uiPriority w:val="21"/>
     <w:qFormat/>
-    <w:rsid w:val="006628C7"/>
+    <w:rsid w:val="00BE4BEF"/>
     <w:rPr>
       <w:i/>
       <w:iCs/>
@@ -2097,7 +2147,7 @@
     <w:link w:val="CitadestacadaCar"/>
     <w:uiPriority w:val="30"/>
     <w:qFormat/>
-    <w:rsid w:val="006628C7"/>
+    <w:rsid w:val="00BE4BEF"/>
     <w:pPr>
       <w:pBdr>
         <w:top w:val="single" w:sz="4" w:space="10" w:color="0F4761" w:themeColor="accent1" w:themeShade="BF"/>
@@ -2118,7 +2168,7 @@
     <w:basedOn w:val="Fuentedeprrafopredeter"/>
     <w:link w:val="Citadestacada"/>
     <w:uiPriority w:val="30"/>
-    <w:rsid w:val="006628C7"/>
+    <w:rsid w:val="00BE4BEF"/>
     <w:rPr>
       <w:i/>
       <w:iCs/>
@@ -2130,7 +2180,7 @@
     <w:basedOn w:val="Fuentedeprrafopredeter"/>
     <w:uiPriority w:val="32"/>
     <w:qFormat/>
-    <w:rsid w:val="006628C7"/>
+    <w:rsid w:val="00BE4BEF"/>
     <w:rPr>
       <w:b/>
       <w:bCs/>

</xml_diff>

<commit_message>
docs: keep activity deliverables in Word format
</commit_message>
<xml_diff>
--- a/docs/Actividad_1_Laboratorio_Tecnico.docx
+++ b/docs/Actividad_1_Laboratorio_Tecnico.docx
@@ -489,6 +489,7 @@
         <w:rPr>
           <w:rFonts w:cs="Times New Roman"/>
         </w:rPr>
+        <w:lastRenderedPageBreak/>
         <w:t>`prometheus-fastapi-instrumentator` expone `/metrics`. Prometheus recolecta cada 15 segundos y Grafana carga automaticamente el dashboard **Mi Microservicio - Operacion**. Este muestra estado del objetivo (`up`), memoria residente, uso de CPU y solicitudes HTTP por handler, metodo y codigo de respuesta. Prometheus se utiliza para recolectar series temporales y Grafana para visualizarlas operacionalmente (Prometheus, n.d.; Grafana Labs, n.d.). Se definieron dos alertas: indisponibilidad de la aplicacion durante un minuto y memoria residente superior a 100 MiB durante cinco minutos.</w:t>
       </w:r>
     </w:p>
@@ -621,7 +622,15 @@
           <w:rFonts w:ascii="Consolas" w:hAnsi="Consolas"/>
           <w:sz w:val="18"/>
         </w:rPr>
-        <w:t>La validacion del flujo encontro una condicion de integracion concreta: Argo CD sincronizo la revision de Git, pero el pod nuevo no puede cumplir `runAsNonRoot` porque la etiqueta remota `yulietrojas/mi-microservicio:latest` contiene una imagen previa que se ejecuta como root. El Dockerfile del repositorio fue endurecido con una imagen runtime distroless y usuario `nonroot:nonroot`; la mejora queda lista para publicacion. Para cerrar el ciclo GitOps con estado `Healthy`, Jenkins debe publicar esta nueva imagen usando una credencial de Docker Hub que tenga permiso para escribir en `yulietrojas/mi-microservicio` y actualizar el tag de `values-dev.yaml`.</w:t>
+        <w:t xml:space="preserve">La validacion del flujo encontro una condicion de integracion concreta: Argo CD sincronizo la revision de Git, pero el pod nuevo no puede cumplir `runAsNonRoot` porque la etiqueta remota `yulietrojas/mi-microservicio:latest` contiene una imagen previa que se ejecuta como root. El Dockerfile del repositorio fue endurecido con una imagen runtime distroless y usuario `nonroot:nonroot`; la mejora queda lista para publicacion. Para cerrar el ciclo GitOps con estado `Healthy`, Jenkins debe publicar esta nueva imagen usando una credencial </w:t>
+      </w:r>
+      <w:r>
+        <w:rPr>
+          <w:rFonts w:ascii="Consolas" w:hAnsi="Consolas"/>
+          <w:sz w:val="18"/>
+        </w:rPr>
+        <w:lastRenderedPageBreak/>
+        <w:t>de Docker Hub que tenga permiso para escribir en `yulietrojas/mi-microservicio` y actualizar el tag de `values-dev.yaml`.</w:t>
       </w:r>
     </w:p>
     <w:p>
@@ -858,6 +867,7 @@
         <w:pStyle w:val="Ttulo1"/>
       </w:pPr>
       <w:r>
+        <w:lastRenderedPageBreak/>
         <w:t>Evidencia visual: dashboard Grafana activo</w:t>
       </w:r>
     </w:p>
@@ -867,7 +877,7 @@
           <w:noProof/>
         </w:rPr>
         <w:drawing>
-          <wp:inline distT="0" distB="0" distL="0" distR="0" wp14:anchorId="7D501ADF" wp14:editId="0E505FA8">
+          <wp:inline distT="0" distB="0" distL="0" distR="0" wp14:anchorId="7D501ADF" wp14:editId="6B2B45C5">
             <wp:extent cx="5842000" cy="3302000"/>
             <wp:effectExtent l="0" t="0" r="6350" b="0"/>
             <wp:docPr id="1169979593" name="Imagen 1"/>
@@ -927,6 +937,7 @@
           <w:b/>
           <w:sz w:val="28"/>
         </w:rPr>
+        <w:lastRenderedPageBreak/>
         <w:t>Anexo A. Evidencias fotograficas de la ejecucion</w:t>
       </w:r>
     </w:p>
@@ -1011,6 +1022,7 @@
         <w:rPr>
           <w:noProof/>
         </w:rPr>
+        <w:lastRenderedPageBreak/>
         <w:drawing>
           <wp:inline distT="0" distB="0" distL="0" distR="0" wp14:anchorId="5235EEB6" wp14:editId="12A7B94D">
             <wp:extent cx="5842000" cy="3788410"/>
@@ -1133,8 +1145,9 @@
         <w:rPr>
           <w:noProof/>
         </w:rPr>
+        <w:lastRenderedPageBreak/>
         <w:drawing>
-          <wp:inline distT="0" distB="0" distL="0" distR="0" wp14:anchorId="574D94F6" wp14:editId="2F8FE29E">
+          <wp:inline distT="0" distB="0" distL="0" distR="0" wp14:anchorId="574D94F6" wp14:editId="2B6F62BA">
             <wp:extent cx="5842000" cy="4064000"/>
             <wp:effectExtent l="0" t="0" r="6350" b="0"/>
             <wp:docPr id="1955968080" name="Imagen 4"/>

</xml_diff>